<commit_message>
update background after capture
</commit_message>
<xml_diff>
--- a/sms_camera_instructions מסמך קיר איימס  17 17 לנובמבר 2017 .docx
+++ b/sms_camera_instructions מסמך קיר איימס  17 17 לנובמבר 2017 .docx
@@ -1,26 +1,42 @@
 
 <file path=word/document.xml><?xml version="1.0" encoding="utf-8"?>
-<w:document xmlns:wpc="http://schemas.microsoft.com/office/word/2010/wordprocessingCanvas" xmlns:mc="http://schemas.openxmlformats.org/markup-compatibility/2006" xmlns:o="urn:schemas-microsoft-com:office:office" xmlns:r="http://schemas.openxmlformats.org/officeDocument/2006/relationships" xmlns:m="http://schemas.openxmlformats.org/officeDocument/2006/math" xmlns:v="urn:schemas-microsoft-com:vml" xmlns:wp14="http://schemas.microsoft.com/office/word/2010/wordprocessingDrawing" xmlns:wp="http://schemas.openxmlformats.org/drawingml/2006/wordprocessingDrawing" xmlns:w10="urn:schemas-microsoft-com:office:word" xmlns:w="http://schemas.openxmlformats.org/wordprocessingml/2006/main" xmlns:w14="http://schemas.microsoft.com/office/word/2010/wordml" xmlns:wpg="http://schemas.microsoft.com/office/word/2010/wordprocessingGroup" xmlns:wpi="http://schemas.microsoft.com/office/word/2010/wordprocessingInk" xmlns:wne="http://schemas.microsoft.com/office/word/2006/wordml" xmlns:wps="http://schemas.microsoft.com/office/word/2010/wordprocessingShape" mc:Ignorable="w14 wp14">
+<w:document xmlns:wpc="http://schemas.microsoft.com/office/word/2010/wordprocessingCanvas" xmlns:cx="http://schemas.microsoft.com/office/drawing/2014/chartex" xmlns:cx1="http://schemas.microsoft.com/office/drawing/2015/9/8/chartex" xmlns:cx2="http://schemas.microsoft.com/office/drawing/2015/10/21/chartex" xmlns:cx3="http://schemas.microsoft.com/office/drawing/2016/5/9/chartex" xmlns:cx4="http://schemas.microsoft.com/office/drawing/2016/5/10/chartex" xmlns:cx5="http://schemas.microsoft.com/office/drawing/2016/5/11/chartex" xmlns:cx6="http://schemas.microsoft.com/office/drawing/2016/5/12/chartex" xmlns:cx7="http://schemas.microsoft.com/office/drawing/2016/5/13/chartex" xmlns:cx8="http://schemas.microsoft.com/office/drawing/2016/5/14/chartex" xmlns:mc="http://schemas.openxmlformats.org/markup-compatibility/2006" xmlns:aink="http://schemas.microsoft.com/office/drawing/2016/ink" xmlns:am3d="http://schemas.microsoft.com/office/drawing/2017/model3d" xmlns:o="urn:schemas-microsoft-com:office:office" xmlns:r="http://schemas.openxmlformats.org/officeDocument/2006/relationships" xmlns:m="http://schemas.openxmlformats.org/officeDocument/2006/math" xmlns:v="urn:schemas-microsoft-com:vml" xmlns:wp14="http://schemas.microsoft.com/office/word/2010/wordprocessingDrawing" xmlns:wp="http://schemas.openxmlformats.org/drawingml/2006/wordprocessingDrawing" xmlns:w10="urn:schemas-microsoft-com:office:word" xmlns:w="http://schemas.openxmlformats.org/wordprocessingml/2006/main" xmlns:w14="http://schemas.microsoft.com/office/word/2010/wordml" xmlns:w15="http://schemas.microsoft.com/office/word/2012/wordml" xmlns:w16cex="http://schemas.microsoft.com/office/word/2018/wordml/cex" xmlns:w16cid="http://schemas.microsoft.com/office/word/2016/wordml/cid" xmlns:w16="http://schemas.microsoft.com/office/word/2018/wordml" xmlns:w16sdtdh="http://schemas.microsoft.com/office/word/2020/wordml/sdtdatahash" xmlns:w16se="http://schemas.microsoft.com/office/word/2015/wordml/symex" xmlns:wpg="http://schemas.microsoft.com/office/word/2010/wordprocessingGroup" xmlns:wpi="http://schemas.microsoft.com/office/word/2010/wordprocessingInk" xmlns:wne="http://schemas.microsoft.com/office/word/2006/wordml" xmlns:wps="http://schemas.microsoft.com/office/word/2010/wordprocessingShape" mc:Ignorable="w14 w15 w16se w16cid w16 w16cex w16sdtdh wp14">
   <w:body>
     <w:p>
       <w:pPr>
-        <w:pStyle w:val="a3"/>
+        <w:pStyle w:val="Title"/>
         <w:rPr>
           <w:sz w:val="36"/>
           <w:szCs w:val="36"/>
         </w:rPr>
       </w:pPr>
       <w:bookmarkStart w:id="0" w:name="_mslzfc14iex2" w:colFirst="0" w:colLast="0"/>
-      <w:bookmarkStart w:id="1" w:name="_GoBack"/>
       <w:bookmarkEnd w:id="0"/>
-      <w:bookmarkEnd w:id="1"/>
       <w:r>
         <w:rPr>
           <w:i/>
           <w:u w:val="single"/>
           <w:rtl/>
         </w:rPr>
-        <w:t xml:space="preserve">מוצג קיר איימס - </w:t>
+        <w:t xml:space="preserve">מוצג קיר </w:t>
+      </w:r>
+      <w:proofErr w:type="spellStart"/>
+      <w:r>
+        <w:rPr>
+          <w:i/>
+          <w:u w:val="single"/>
+          <w:rtl/>
+        </w:rPr>
+        <w:t>איימס</w:t>
+      </w:r>
+      <w:proofErr w:type="spellEnd"/>
+      <w:r>
+        <w:rPr>
+          <w:i/>
+          <w:u w:val="single"/>
+          <w:rtl/>
+        </w:rPr>
+        <w:t xml:space="preserve"> - </w:t>
       </w:r>
       <w:r>
         <w:rPr>
@@ -741,12 +757,12 @@
     </w:p>
     <w:p>
       <w:pPr>
-        <w:pStyle w:val="1"/>
+        <w:pStyle w:val="Heading1"/>
         <w:bidi/>
         <w:jc w:val="center"/>
       </w:pPr>
-      <w:bookmarkStart w:id="2" w:name="_o7pxm2quhgvh" w:colFirst="0" w:colLast="0"/>
-      <w:bookmarkEnd w:id="2"/>
+      <w:bookmarkStart w:id="1" w:name="_o7pxm2quhgvh" w:colFirst="0" w:colLast="0"/>
+      <w:bookmarkEnd w:id="1"/>
       <w:r>
         <w:rPr>
           <w:rtl/>
@@ -757,16 +773,121 @@
     </w:p>
     <w:p>
       <w:pPr>
-        <w:pStyle w:val="2"/>
-        <w:bidi/>
-      </w:pPr>
-      <w:bookmarkStart w:id="3" w:name="_ktnx0zun2yaa" w:colFirst="0" w:colLast="0"/>
+        <w:pStyle w:val="Heading2"/>
+        <w:bidi/>
+      </w:pPr>
+      <w:bookmarkStart w:id="2" w:name="_ktnx0zun2yaa" w:colFirst="0" w:colLast="0"/>
+      <w:bookmarkEnd w:id="2"/>
+      <w:r>
+        <w:rPr>
+          <w:rtl/>
+        </w:rPr>
+        <w:t>רקע והשראה</w:t>
+      </w:r>
+    </w:p>
+    <w:p>
+      <w:pPr>
+        <w:bidi/>
+      </w:pPr>
+      <w:r>
+        <w:t>...</w:t>
+      </w:r>
+    </w:p>
+    <w:p>
+      <w:pPr>
+        <w:bidi/>
+      </w:pPr>
+    </w:p>
+    <w:p>
+      <w:pPr>
+        <w:pStyle w:val="Heading2"/>
+        <w:bidi/>
+      </w:pPr>
+      <w:bookmarkStart w:id="3" w:name="_wxlwlmjgqkdh" w:colFirst="0" w:colLast="0"/>
       <w:bookmarkEnd w:id="3"/>
       <w:r>
         <w:rPr>
           <w:rtl/>
         </w:rPr>
-        <w:t>רקע והשראה</w:t>
+        <w:t>קרדיט</w:t>
+      </w:r>
+    </w:p>
+    <w:p>
+      <w:pPr>
+        <w:bidi/>
+      </w:pPr>
+      <w:r>
+        <w:rPr>
+          <w:rtl/>
+        </w:rPr>
+        <w:t xml:space="preserve">רעיון מקורי + תמיכה, </w:t>
+      </w:r>
+      <w:r>
+        <w:rPr>
+          <w:b/>
+          <w:rtl/>
+        </w:rPr>
+        <w:t>אמיר בן שלום</w:t>
+      </w:r>
+      <w:r>
+        <w:t>.</w:t>
+      </w:r>
+    </w:p>
+    <w:p>
+      <w:pPr>
+        <w:bidi/>
+        <w:rPr>
+          <w:b/>
+        </w:rPr>
+      </w:pPr>
+      <w:r>
+        <w:rPr>
+          <w:rtl/>
+        </w:rPr>
+        <w:t xml:space="preserve">מו"פ חומרה ותוכנה, </w:t>
+      </w:r>
+      <w:proofErr w:type="spellStart"/>
+      <w:r>
+        <w:rPr>
+          <w:rtl/>
+        </w:rPr>
+        <w:t>מסמכיאדה</w:t>
+      </w:r>
+      <w:proofErr w:type="spellEnd"/>
+      <w:r>
+        <w:rPr>
+          <w:rtl/>
+        </w:rPr>
+        <w:t xml:space="preserve"> ותיעוד, </w:t>
+      </w:r>
+      <w:r>
+        <w:rPr>
+          <w:b/>
+          <w:rtl/>
+        </w:rPr>
+        <w:t>ארד אייזן</w:t>
+      </w:r>
+      <w:r>
+        <w:t>.</w:t>
+      </w:r>
+    </w:p>
+    <w:p>
+      <w:pPr>
+        <w:bidi/>
+      </w:pPr>
+    </w:p>
+    <w:p>
+      <w:pPr>
+        <w:pStyle w:val="Heading2"/>
+        <w:bidi/>
+      </w:pPr>
+      <w:bookmarkStart w:id="4" w:name="_wjubz3rfjgn1" w:colFirst="0" w:colLast="0"/>
+      <w:bookmarkEnd w:id="4"/>
+      <w:r>
+        <w:rPr>
+          <w:rtl/>
+        </w:rPr>
+        <w:t>טכנולוגיות במוצג</w:t>
       </w:r>
     </w:p>
     <w:p>
@@ -784,80 +905,16 @@
     </w:p>
     <w:p>
       <w:pPr>
-        <w:pStyle w:val="2"/>
-        <w:bidi/>
-      </w:pPr>
-      <w:bookmarkStart w:id="4" w:name="_wxlwlmjgqkdh" w:colFirst="0" w:colLast="0"/>
-      <w:bookmarkEnd w:id="4"/>
-      <w:r>
-        <w:rPr>
-          <w:rtl/>
-        </w:rPr>
-        <w:t>קרדיט</w:t>
-      </w:r>
-    </w:p>
-    <w:p>
-      <w:pPr>
-        <w:bidi/>
-      </w:pPr>
-      <w:r>
-        <w:rPr>
-          <w:rtl/>
-        </w:rPr>
-        <w:t xml:space="preserve">רעיון מקורי + תמיכה, </w:t>
-      </w:r>
-      <w:r>
-        <w:rPr>
-          <w:b/>
-          <w:rtl/>
-        </w:rPr>
-        <w:t>אמיר בן שלום</w:t>
-      </w:r>
-      <w:r>
-        <w:t>.</w:t>
-      </w:r>
-    </w:p>
-    <w:p>
-      <w:pPr>
-        <w:bidi/>
-        <w:rPr>
-          <w:b/>
-        </w:rPr>
-      </w:pPr>
-      <w:r>
-        <w:rPr>
-          <w:rtl/>
-        </w:rPr>
-        <w:t xml:space="preserve">מו"פ חומרה ותוכנה, מסמכיאדה ותיעוד, </w:t>
-      </w:r>
-      <w:r>
-        <w:rPr>
-          <w:b/>
-          <w:rtl/>
-        </w:rPr>
-        <w:t>ארד אייזן</w:t>
-      </w:r>
-      <w:r>
-        <w:t>.</w:t>
-      </w:r>
-    </w:p>
-    <w:p>
-      <w:pPr>
-        <w:bidi/>
-      </w:pPr>
-    </w:p>
-    <w:p>
-      <w:pPr>
-        <w:pStyle w:val="2"/>
-        <w:bidi/>
-      </w:pPr>
-      <w:bookmarkStart w:id="5" w:name="_wjubz3rfjgn1" w:colFirst="0" w:colLast="0"/>
+        <w:pStyle w:val="Heading2"/>
+        <w:bidi/>
+      </w:pPr>
+      <w:bookmarkStart w:id="5" w:name="_lipued8i0pi" w:colFirst="0" w:colLast="0"/>
       <w:bookmarkEnd w:id="5"/>
       <w:r>
         <w:rPr>
           <w:rtl/>
         </w:rPr>
-        <w:t>טכנולוגיות במוצג</w:t>
+        <w:t>מרכיבי המוצג</w:t>
       </w:r>
     </w:p>
     <w:p>
@@ -875,38 +932,11 @@
     </w:p>
     <w:p>
       <w:pPr>
-        <w:pStyle w:val="2"/>
-        <w:bidi/>
-      </w:pPr>
-      <w:bookmarkStart w:id="6" w:name="_lipued8i0pi" w:colFirst="0" w:colLast="0"/>
+        <w:pStyle w:val="Heading2"/>
+        <w:bidi/>
+      </w:pPr>
+      <w:bookmarkStart w:id="6" w:name="_rltr9t1ux7zy" w:colFirst="0" w:colLast="0"/>
       <w:bookmarkEnd w:id="6"/>
-      <w:r>
-        <w:rPr>
-          <w:rtl/>
-        </w:rPr>
-        <w:t>מרכיבי המוצג</w:t>
-      </w:r>
-    </w:p>
-    <w:p>
-      <w:pPr>
-        <w:bidi/>
-      </w:pPr>
-      <w:r>
-        <w:t>...</w:t>
-      </w:r>
-    </w:p>
-    <w:p>
-      <w:pPr>
-        <w:bidi/>
-      </w:pPr>
-    </w:p>
-    <w:p>
-      <w:pPr>
-        <w:pStyle w:val="2"/>
-        <w:bidi/>
-      </w:pPr>
-      <w:bookmarkStart w:id="7" w:name="_rltr9t1ux7zy" w:colFirst="0" w:colLast="0"/>
-      <w:bookmarkEnd w:id="7"/>
       <w:r>
         <w:rPr>
           <w:rtl/>
@@ -927,13 +957,7 @@
         <w:rPr>
           <w:rtl/>
         </w:rPr>
-        <w:t xml:space="preserve">מישהו שולח </w:t>
-      </w:r>
-      <w:r>
-        <w:rPr>
-          <w:rtl/>
-        </w:rPr>
-        <w:t>מסרון למוצג.</w:t>
+        <w:t>מישהו שולח מסרון למוצג.</w:t>
       </w:r>
     </w:p>
     <w:p>
@@ -945,11 +969,19 @@
         <w:bidi/>
         <w:contextualSpacing/>
       </w:pPr>
-      <w:r>
-        <w:rPr>
-          <w:rtl/>
-        </w:rPr>
-        <w:t>מק"מש ה</w:t>
+      <w:proofErr w:type="spellStart"/>
+      <w:r>
+        <w:rPr>
+          <w:rtl/>
+        </w:rPr>
+        <w:t>מק"מש</w:t>
+      </w:r>
+      <w:proofErr w:type="spellEnd"/>
+      <w:r>
+        <w:rPr>
+          <w:rtl/>
+        </w:rPr>
+        <w:t xml:space="preserve"> ה</w:t>
       </w:r>
       <w:r>
         <w:t>GSM</w:t>
@@ -1058,13 +1090,7 @@
         <w:rPr>
           <w:rtl/>
         </w:rPr>
-        <w:t xml:space="preserve">המחשב </w:t>
-      </w:r>
-      <w:r>
-        <w:rPr>
-          <w:rtl/>
-        </w:rPr>
-        <w:t>שולח חזרה את הקישור דרך מקמ"ש ה</w:t>
+        <w:t>המחשב שולח חזרה את הקישור דרך מקמ"ש ה</w:t>
       </w:r>
       <w:r>
         <w:t>GSM</w:t>
@@ -1086,12 +1112,12 @@
     </w:p>
     <w:p>
       <w:pPr>
-        <w:pStyle w:val="1"/>
+        <w:pStyle w:val="Heading1"/>
         <w:bidi/>
         <w:jc w:val="center"/>
       </w:pPr>
-      <w:bookmarkStart w:id="8" w:name="_ib3wnis2z5ps" w:colFirst="0" w:colLast="0"/>
-      <w:bookmarkEnd w:id="8"/>
+      <w:bookmarkStart w:id="7" w:name="_ib3wnis2z5ps" w:colFirst="0" w:colLast="0"/>
+      <w:bookmarkEnd w:id="7"/>
       <w:r>
         <w:rPr>
           <w:rtl/>
@@ -1102,38 +1128,38 @@
     </w:p>
     <w:p>
       <w:pPr>
-        <w:pStyle w:val="2"/>
-        <w:bidi/>
-      </w:pPr>
-      <w:bookmarkStart w:id="9" w:name="_7u83hkkydkei" w:colFirst="0" w:colLast="0"/>
+        <w:pStyle w:val="Heading2"/>
+        <w:bidi/>
+      </w:pPr>
+      <w:bookmarkStart w:id="8" w:name="_7u83hkkydkei" w:colFirst="0" w:colLast="0"/>
+      <w:bookmarkEnd w:id="8"/>
+      <w:r>
+        <w:rPr>
+          <w:rtl/>
+        </w:rPr>
+        <w:t>סדר הדלקה</w:t>
+      </w:r>
+    </w:p>
+    <w:p>
+      <w:pPr>
+        <w:bidi/>
+      </w:pPr>
+      <w:r>
+        <w:t>...</w:t>
+      </w:r>
+    </w:p>
+    <w:p>
+      <w:pPr>
+        <w:bidi/>
+      </w:pPr>
+    </w:p>
+    <w:p>
+      <w:pPr>
+        <w:pStyle w:val="Heading2"/>
+        <w:bidi/>
+      </w:pPr>
+      <w:bookmarkStart w:id="9" w:name="_karyqoegzrm9" w:colFirst="0" w:colLast="0"/>
       <w:bookmarkEnd w:id="9"/>
-      <w:r>
-        <w:rPr>
-          <w:rtl/>
-        </w:rPr>
-        <w:t>סדר הדלקה</w:t>
-      </w:r>
-    </w:p>
-    <w:p>
-      <w:pPr>
-        <w:bidi/>
-      </w:pPr>
-      <w:r>
-        <w:t>...</w:t>
-      </w:r>
-    </w:p>
-    <w:p>
-      <w:pPr>
-        <w:bidi/>
-      </w:pPr>
-    </w:p>
-    <w:p>
-      <w:pPr>
-        <w:pStyle w:val="2"/>
-        <w:bidi/>
-      </w:pPr>
-      <w:bookmarkStart w:id="10" w:name="_karyqoegzrm9" w:colFirst="0" w:colLast="0"/>
-      <w:bookmarkEnd w:id="10"/>
       <w:r>
         <w:rPr>
           <w:rtl/>
@@ -1165,7 +1191,7 @@
         </w:rPr>
         <w:br/>
       </w:r>
-      <w:hyperlink r:id="rId8">
+      <w:hyperlink r:id="rId7">
         <w:r>
           <w:rPr>
             <w:color w:val="1155CC"/>
@@ -1202,12 +1228,14 @@
         </w:rPr>
         <w:t xml:space="preserve"> והסיסמה </w:t>
       </w:r>
+      <w:proofErr w:type="spellStart"/>
       <w:r>
         <w:rPr>
           <w:b/>
         </w:rPr>
         <w:t>keepkipod</w:t>
       </w:r>
+      <w:proofErr w:type="spellEnd"/>
       <w:r>
         <w:t>.</w:t>
       </w:r>
@@ -1234,13 +1262,7 @@
         <w:rPr>
           <w:rtl/>
         </w:rPr>
-        <w:t>04, א</w:t>
-      </w:r>
-      <w:r>
-        <w:rPr>
-          <w:rtl/>
-        </w:rPr>
-        <w:t>מור להיות מוקף בירוק, אם לא אז לא מחובר לחשמל / לאינטרנט.</w:t>
+        <w:t>04, אמור להיות מוקף בירוק, אם לא אז לא מחובר לחשמל / לאינטרנט.</w:t>
       </w:r>
     </w:p>
     <w:p>
@@ -1326,7 +1348,7 @@
         </w:rPr>
         <w:t xml:space="preserve">, התוצרים נמצאים בתיקייה המשותפת: </w:t>
       </w:r>
-      <w:hyperlink r:id="rId9">
+      <w:hyperlink r:id="rId8">
         <w:r>
           <w:rPr>
             <w:color w:val="1155CC"/>
@@ -1346,11 +1368,11 @@
     </w:p>
     <w:p>
       <w:pPr>
-        <w:pStyle w:val="2"/>
-        <w:bidi/>
-      </w:pPr>
-      <w:bookmarkStart w:id="11" w:name="_frx31wahflwp" w:colFirst="0" w:colLast="0"/>
-      <w:bookmarkEnd w:id="11"/>
+        <w:pStyle w:val="Heading2"/>
+        <w:bidi/>
+      </w:pPr>
+      <w:bookmarkStart w:id="10" w:name="_frx31wahflwp" w:colFirst="0" w:colLast="0"/>
+      <w:bookmarkEnd w:id="10"/>
       <w:r>
         <w:rPr>
           <w:rtl/>
@@ -1379,7 +1401,7 @@
         </w:rPr>
         <w:br/>
       </w:r>
-      <w:hyperlink r:id="rId10">
+      <w:hyperlink r:id="rId9">
         <w:r>
           <w:rPr>
             <w:color w:val="1155CC"/>
@@ -1414,20 +1436,16 @@
         <w:rPr>
           <w:rtl/>
         </w:rPr>
-        <w:t xml:space="preserve"> </w:t>
-      </w:r>
-      <w:r>
-        <w:rPr>
-          <w:rtl/>
-        </w:rPr>
-        <w:t xml:space="preserve">והסיסמה </w:t>
-      </w:r>
+        <w:t xml:space="preserve"> והסיסמה </w:t>
+      </w:r>
+      <w:proofErr w:type="spellStart"/>
       <w:r>
         <w:rPr>
           <w:b/>
         </w:rPr>
         <w:t>keepkipod</w:t>
       </w:r>
+      <w:proofErr w:type="spellEnd"/>
       <w:r>
         <w:t>.</w:t>
       </w:r>
@@ -1461,11 +1479,27 @@
           <w:rtl/>
         </w:rPr>
         <w:br/>
-        <w:t>אמור להופיע טרמינאל עם הכיתוב: $/:</w:t>
-      </w:r>
+        <w:t xml:space="preserve">אמור להופיע </w:t>
+      </w:r>
+      <w:proofErr w:type="spellStart"/>
+      <w:r>
+        <w:rPr>
+          <w:rtl/>
+        </w:rPr>
+        <w:t>טרמינאל</w:t>
+      </w:r>
+      <w:proofErr w:type="spellEnd"/>
+      <w:r>
+        <w:rPr>
+          <w:rtl/>
+        </w:rPr>
+        <w:t xml:space="preserve"> עם הכיתוב: $/:</w:t>
+      </w:r>
+      <w:proofErr w:type="spellStart"/>
       <w:r>
         <w:t>dataplicity@pi</w:t>
       </w:r>
+      <w:proofErr w:type="spellEnd"/>
       <w:r>
         <w:rPr>
           <w:rtl/>
@@ -1486,13 +1520,35 @@
         <w:rPr>
           <w:rtl/>
         </w:rPr>
-        <w:t xml:space="preserve">יש להיכנס למשתמש הדיפולטי: </w:t>
-      </w:r>
+        <w:t xml:space="preserve">יש להיכנס למשתמש </w:t>
+      </w:r>
+      <w:proofErr w:type="spellStart"/>
+      <w:r>
+        <w:rPr>
+          <w:rtl/>
+        </w:rPr>
+        <w:t>הדיפולטי</w:t>
+      </w:r>
+      <w:proofErr w:type="spellEnd"/>
+      <w:r>
+        <w:rPr>
+          <w:rtl/>
+        </w:rPr>
+        <w:t xml:space="preserve">: </w:t>
+      </w:r>
+      <w:proofErr w:type="spellStart"/>
       <w:r>
         <w:rPr>
           <w:b/>
         </w:rPr>
-        <w:t>su pi</w:t>
+        <w:t>su</w:t>
+      </w:r>
+      <w:proofErr w:type="spellEnd"/>
+      <w:r>
+        <w:rPr>
+          <w:b/>
+        </w:rPr>
+        <w:t xml:space="preserve"> pi</w:t>
       </w:r>
     </w:p>
     <w:p>
@@ -1508,7 +1564,21 @@
         <w:rPr>
           <w:rtl/>
         </w:rPr>
-        <w:t xml:space="preserve">יש להכניס את הסיסמה (דיפולטית היא </w:t>
+        <w:t>יש להכניס את הסיסמה (</w:t>
+      </w:r>
+      <w:proofErr w:type="spellStart"/>
+      <w:r>
+        <w:rPr>
+          <w:rtl/>
+        </w:rPr>
+        <w:t>דיפולטית</w:t>
+      </w:r>
+      <w:proofErr w:type="spellEnd"/>
+      <w:r>
+        <w:rPr>
+          <w:rtl/>
+        </w:rPr>
+        <w:t xml:space="preserve"> היא </w:t>
       </w:r>
       <w:r>
         <w:t>raspberry</w:t>
@@ -1539,13 +1609,7 @@
         <w:rPr>
           <w:rtl/>
         </w:rPr>
-        <w:t xml:space="preserve">עכשיו אפשר </w:t>
-      </w:r>
-      <w:r>
-        <w:rPr>
-          <w:rtl/>
-        </w:rPr>
-        <w:t>להריץ פקודות על המחשב של המוצג, ראה טבלת פקודות.</w:t>
+        <w:t>עכשיו אפשר להריץ פקודות על המחשב של המוצג, ראה טבלת פקודות.</w:t>
       </w:r>
     </w:p>
     <w:p>
@@ -1568,28 +1632,28 @@
     </w:p>
     <w:p>
       <w:pPr>
-        <w:pStyle w:val="2"/>
-        <w:bidi/>
-      </w:pPr>
-      <w:bookmarkStart w:id="12" w:name="_quo5ac9muz9t" w:colFirst="0" w:colLast="0"/>
-      <w:bookmarkEnd w:id="12"/>
+        <w:pStyle w:val="Heading2"/>
+        <w:bidi/>
+      </w:pPr>
+      <w:bookmarkStart w:id="11" w:name="_quo5ac9muz9t" w:colFirst="0" w:colLast="0"/>
+      <w:bookmarkEnd w:id="11"/>
       <w:r>
         <w:rPr>
           <w:rtl/>
         </w:rPr>
         <w:lastRenderedPageBreak/>
-        <w:t>פקודות לטרמינאל</w:t>
-      </w:r>
-    </w:p>
-    <w:p>
-      <w:pPr>
-        <w:bidi/>
-      </w:pPr>
-      <w:r>
-        <w:rPr>
-          <w:rtl/>
-        </w:rPr>
-        <w:t>אפשר להקליד אותן בטרמינאל מרוחק או ישירות למחשב המוצג (עם מקלדת ומסך),</w:t>
+        <w:t>פקודות לטרמינל</w:t>
+      </w:r>
+    </w:p>
+    <w:p>
+      <w:pPr>
+        <w:bidi/>
+      </w:pPr>
+      <w:r>
+        <w:rPr>
+          <w:rtl/>
+        </w:rPr>
+        <w:t>אפשר להקליד אותן בטרמינל מרוחק או ישירות למחשב המוצג (עם מקלדת ומסך),</w:t>
       </w:r>
     </w:p>
     <w:p>
@@ -1602,12 +1666,14 @@
         </w:rPr>
         <w:t xml:space="preserve">לנוחות אפשר להקיש רק </w:t>
       </w:r>
+      <w:proofErr w:type="spellStart"/>
       <w:r>
         <w:rPr>
           <w:b/>
         </w:rPr>
         <w:t>sms</w:t>
       </w:r>
+      <w:proofErr w:type="spellEnd"/>
       <w:r>
         <w:rPr>
           <w:rtl/>
@@ -1631,7 +1697,7 @@
     </w:p>
     <w:tbl>
       <w:tblPr>
-        <w:tblStyle w:val="a5"/>
+        <w:tblStyle w:val="a"/>
         <w:bidiVisual/>
         <w:tblW w:w="9000" w:type="dxa"/>
         <w:tblInd w:w="100" w:type="dxa"/>
@@ -1732,13 +1798,7 @@
               <w:rPr>
                 <w:rtl/>
               </w:rPr>
-              <w:t>הצגת לוגים של פעולת התוכנה</w:t>
-            </w:r>
-            <w:r>
-              <w:rPr>
-                <w:rtl/>
-              </w:rPr>
-              <w:t xml:space="preserve"> בזמן אמת</w:t>
+              <w:t>הצגת לוגים של פעולת התוכנה בזמן אמת</w:t>
             </w:r>
           </w:p>
           <w:p>
@@ -1753,9 +1813,11 @@
               </w:rPr>
               <w:t xml:space="preserve">יציאה ב </w:t>
             </w:r>
+            <w:proofErr w:type="spellStart"/>
             <w:r>
               <w:t>ctrl+c</w:t>
             </w:r>
+            <w:proofErr w:type="spellEnd"/>
           </w:p>
         </w:tc>
         <w:tc>
@@ -1774,18 +1836,22 @@
               <w:widowControl w:val="0"/>
               <w:spacing w:line="240" w:lineRule="auto"/>
             </w:pPr>
+            <w:proofErr w:type="spellStart"/>
             <w:r>
               <w:t>sms_camera_log</w:t>
             </w:r>
+            <w:proofErr w:type="spellEnd"/>
           </w:p>
           <w:p>
             <w:pPr>
               <w:widowControl w:val="0"/>
               <w:spacing w:line="240" w:lineRule="auto"/>
             </w:pPr>
+            <w:proofErr w:type="spellStart"/>
             <w:r>
               <w:t>sms_camera_log_all</w:t>
             </w:r>
+            <w:proofErr w:type="spellEnd"/>
           </w:p>
         </w:tc>
       </w:tr>
@@ -1813,9 +1879,11 @@
               </w:rPr>
               <w:t xml:space="preserve">עצירת התוכנה (בשביל לצלם למייל, צריך להפעיל מחדש אח"כ ע"י </w:t>
             </w:r>
+            <w:proofErr w:type="spellStart"/>
             <w:r>
               <w:t>sms_camera_restart</w:t>
             </w:r>
+            <w:proofErr w:type="spellEnd"/>
             <w:r>
               <w:rPr>
                 <w:rtl/>
@@ -1840,9 +1908,11 @@
               <w:widowControl w:val="0"/>
               <w:spacing w:line="240" w:lineRule="auto"/>
             </w:pPr>
+            <w:proofErr w:type="spellStart"/>
             <w:r>
               <w:t>sms_camera_stop</w:t>
             </w:r>
+            <w:proofErr w:type="spellEnd"/>
           </w:p>
         </w:tc>
       </w:tr>
@@ -1870,9 +1940,11 @@
               </w:rPr>
               <w:t xml:space="preserve">צילום תמונה או סרטון ושליחת מייל, אפשרי רק כשהתוכנה לא רצה </w:t>
             </w:r>
+            <w:proofErr w:type="spellStart"/>
             <w:r>
               <w:t>sms_camera_stop</w:t>
             </w:r>
+            <w:proofErr w:type="spellEnd"/>
             <w:r>
               <w:rPr>
                 <w:rtl/>
@@ -1899,12 +1971,19 @@
               <w:spacing w:line="240" w:lineRule="auto"/>
               <w:jc w:val="right"/>
             </w:pPr>
-            <w:r>
-              <w:t>sms_camera_mail_picture e</w:t>
-            </w:r>
-            <w:r>
-              <w:t>mail@blabla</w:t>
-            </w:r>
+            <w:proofErr w:type="spellStart"/>
+            <w:r>
+              <w:t>sms_camera_mail_picture</w:t>
+            </w:r>
+            <w:proofErr w:type="spellEnd"/>
+            <w:r>
+              <w:t xml:space="preserve"> </w:t>
+            </w:r>
+            <w:proofErr w:type="spellStart"/>
+            <w:r>
+              <w:t>email@blabla</w:t>
+            </w:r>
+            <w:proofErr w:type="spellEnd"/>
           </w:p>
           <w:p>
             <w:pPr>
@@ -1913,9 +1992,19 @@
               <w:spacing w:line="240" w:lineRule="auto"/>
               <w:jc w:val="right"/>
             </w:pPr>
-            <w:r>
-              <w:t>sms_camera_mail_video email@blabla</w:t>
-            </w:r>
+            <w:proofErr w:type="spellStart"/>
+            <w:r>
+              <w:t>sms_camera_mail_video</w:t>
+            </w:r>
+            <w:proofErr w:type="spellEnd"/>
+            <w:r>
+              <w:t xml:space="preserve"> </w:t>
+            </w:r>
+            <w:proofErr w:type="spellStart"/>
+            <w:r>
+              <w:t>email@blabla</w:t>
+            </w:r>
+            <w:proofErr w:type="spellEnd"/>
           </w:p>
         </w:tc>
       </w:tr>
@@ -1941,7 +2030,21 @@
               <w:rPr>
                 <w:rtl/>
               </w:rPr>
-              <w:t>הפעלת התוכנה מחדש ללא ריסוט המחשב (אם יש שגיאת מקמ"ש בלוג, או תקלה אחרת..)</w:t>
+              <w:t xml:space="preserve">הפעלת התוכנה מחדש ללא </w:t>
+            </w:r>
+            <w:proofErr w:type="spellStart"/>
+            <w:r>
+              <w:rPr>
+                <w:rtl/>
+              </w:rPr>
+              <w:t>ריסוט</w:t>
+            </w:r>
+            <w:proofErr w:type="spellEnd"/>
+            <w:r>
+              <w:rPr>
+                <w:rtl/>
+              </w:rPr>
+              <w:t xml:space="preserve"> המחשב (אם יש שגיאת מקמ"ש בלוג, או תקלה אחרת..)</w:t>
             </w:r>
           </w:p>
         </w:tc>
@@ -1961,9 +2064,11 @@
               <w:widowControl w:val="0"/>
               <w:spacing w:line="240" w:lineRule="auto"/>
             </w:pPr>
+            <w:proofErr w:type="spellStart"/>
             <w:r>
               <w:t>sms_camera_restart</w:t>
             </w:r>
+            <w:proofErr w:type="spellEnd"/>
           </w:p>
         </w:tc>
       </w:tr>
@@ -1989,7 +2094,21 @@
               <w:rPr>
                 <w:rtl/>
               </w:rPr>
-              <w:t>הפעלת מק"מש ה</w:t>
+              <w:t xml:space="preserve">הפעלת </w:t>
+            </w:r>
+            <w:proofErr w:type="spellStart"/>
+            <w:r>
+              <w:rPr>
+                <w:rtl/>
+              </w:rPr>
+              <w:t>מק"מש</w:t>
+            </w:r>
+            <w:proofErr w:type="spellEnd"/>
+            <w:r>
+              <w:rPr>
+                <w:rtl/>
+              </w:rPr>
+              <w:t xml:space="preserve"> ה</w:t>
             </w:r>
             <w:r>
               <w:t>GSM</w:t>
@@ -2033,9 +2152,11 @@
               <w:spacing w:line="240" w:lineRule="auto"/>
               <w:jc w:val="right"/>
             </w:pPr>
+            <w:proofErr w:type="spellStart"/>
             <w:r>
               <w:t>sms_camera_usb_restart</w:t>
             </w:r>
+            <w:proofErr w:type="spellEnd"/>
           </w:p>
           <w:p>
             <w:pPr>
@@ -2071,11 +2192,19 @@
               </w:rPr>
               <w:t xml:space="preserve">הפעלת המחשב מחדש - </w:t>
             </w:r>
-            <w:r>
-              <w:rPr>
-                <w:rtl/>
-              </w:rPr>
-              <w:t>ריסוט הפאי,</w:t>
+            <w:proofErr w:type="spellStart"/>
+            <w:r>
+              <w:rPr>
+                <w:rtl/>
+              </w:rPr>
+              <w:t>ריסוט</w:t>
+            </w:r>
+            <w:proofErr w:type="spellEnd"/>
+            <w:r>
+              <w:rPr>
+                <w:rtl/>
+              </w:rPr>
+              <w:t xml:space="preserve"> הפאי,</w:t>
             </w:r>
           </w:p>
           <w:p>
@@ -2108,8 +2237,13 @@
               <w:widowControl w:val="0"/>
               <w:spacing w:line="240" w:lineRule="auto"/>
             </w:pPr>
-            <w:r>
-              <w:t>sudo reboot</w:t>
+            <w:proofErr w:type="spellStart"/>
+            <w:r>
+              <w:t>sudo</w:t>
+            </w:r>
+            <w:proofErr w:type="spellEnd"/>
+            <w:r>
+              <w:t xml:space="preserve"> reboot</w:t>
             </w:r>
           </w:p>
         </w:tc>
@@ -2138,11 +2272,11 @@
     </w:p>
     <w:p>
       <w:pPr>
-        <w:pStyle w:val="2"/>
-        <w:bidi/>
-      </w:pPr>
-      <w:bookmarkStart w:id="13" w:name="_cbc1v1z4qswl" w:colFirst="0" w:colLast="0"/>
-      <w:bookmarkEnd w:id="13"/>
+        <w:pStyle w:val="Heading2"/>
+        <w:bidi/>
+      </w:pPr>
+      <w:bookmarkStart w:id="12" w:name="_cbc1v1z4qswl" w:colFirst="0" w:colLast="0"/>
+      <w:bookmarkEnd w:id="12"/>
       <w:r>
         <w:rPr>
           <w:rtl/>
@@ -2161,31 +2295,66 @@
     </w:p>
     <w:p>
       <w:pPr>
-        <w:pStyle w:val="1"/>
+        <w:pStyle w:val="Heading1"/>
         <w:bidi/>
         <w:jc w:val="center"/>
       </w:pPr>
-      <w:bookmarkStart w:id="14" w:name="_zesnnt8x6cic" w:colFirst="0" w:colLast="0"/>
+      <w:bookmarkStart w:id="13" w:name="_zesnnt8x6cic" w:colFirst="0" w:colLast="0"/>
+      <w:bookmarkEnd w:id="13"/>
+      <w:r>
+        <w:rPr>
+          <w:rtl/>
+        </w:rPr>
+        <w:t>שרטוטים ותרשימים</w:t>
+      </w:r>
+    </w:p>
+    <w:p>
+      <w:pPr>
+        <w:pStyle w:val="Heading2"/>
+        <w:bidi/>
+      </w:pPr>
+      <w:bookmarkStart w:id="14" w:name="_spyg5phu0prh" w:colFirst="0" w:colLast="0"/>
       <w:bookmarkEnd w:id="14"/>
       <w:r>
         <w:rPr>
           <w:rtl/>
         </w:rPr>
-        <w:t>שרטוטים ותרשימים</w:t>
-      </w:r>
-    </w:p>
-    <w:p>
-      <w:pPr>
-        <w:pStyle w:val="2"/>
-        <w:bidi/>
-      </w:pPr>
-      <w:bookmarkStart w:id="15" w:name="_spyg5phu0prh" w:colFirst="0" w:colLast="0"/>
+        <w:t xml:space="preserve">לחצנים </w:t>
+      </w:r>
+      <w:proofErr w:type="spellStart"/>
+      <w:r>
+        <w:rPr>
+          <w:rtl/>
+        </w:rPr>
+        <w:t>ולדים</w:t>
+      </w:r>
+      <w:proofErr w:type="spellEnd"/>
+    </w:p>
+    <w:p>
+      <w:pPr>
+        <w:bidi/>
+      </w:pPr>
+      <w:r>
+        <w:t>...</w:t>
+      </w:r>
+    </w:p>
+    <w:p>
+      <w:pPr>
+        <w:bidi/>
+      </w:pPr>
+    </w:p>
+    <w:p>
+      <w:pPr>
+        <w:pStyle w:val="Heading2"/>
+        <w:bidi/>
+      </w:pPr>
+      <w:bookmarkStart w:id="15" w:name="_wy2pl7dqzs5n" w:colFirst="0" w:colLast="0"/>
       <w:bookmarkEnd w:id="15"/>
       <w:r>
         <w:rPr>
           <w:rtl/>
         </w:rPr>
-        <w:t>לחצנים ולדים</w:t>
+        <w:t>אלקטרוניקה</w:t>
       </w:r>
     </w:p>
     <w:p>
@@ -2196,36 +2365,9 @@
         <w:t>...</w:t>
       </w:r>
     </w:p>
-    <w:p>
-      <w:pPr>
-        <w:bidi/>
-      </w:pPr>
-    </w:p>
-    <w:p>
-      <w:pPr>
-        <w:pStyle w:val="2"/>
-        <w:bidi/>
-      </w:pPr>
-      <w:bookmarkStart w:id="16" w:name="_wy2pl7dqzs5n" w:colFirst="0" w:colLast="0"/>
-      <w:bookmarkEnd w:id="16"/>
-      <w:r>
-        <w:rPr>
-          <w:rtl/>
-        </w:rPr>
-        <w:t>אלקטרוניקה</w:t>
-      </w:r>
-    </w:p>
-    <w:p>
-      <w:pPr>
-        <w:bidi/>
-      </w:pPr>
-      <w:r>
-        <w:t>...</w:t>
-      </w:r>
-    </w:p>
     <w:sectPr>
-      <w:headerReference w:type="default" r:id="rId11"/>
-      <w:footerReference w:type="default" r:id="rId12"/>
+      <w:headerReference w:type="default" r:id="rId10"/>
+      <w:footerReference w:type="default" r:id="rId11"/>
       <w:pgSz w:w="11909" w:h="16834"/>
       <w:pgMar w:top="1440" w:right="1440" w:bottom="1440" w:left="1440" w:header="0" w:footer="720" w:gutter="0"/>
       <w:pgNumType w:start="1"/>
@@ -2236,7 +2378,7 @@
 </file>
 
 <file path=word/endnotes.xml><?xml version="1.0" encoding="utf-8"?>
-<w:endnotes xmlns:wpc="http://schemas.microsoft.com/office/word/2010/wordprocessingCanvas" xmlns:mc="http://schemas.openxmlformats.org/markup-compatibility/2006" xmlns:o="urn:schemas-microsoft-com:office:office" xmlns:r="http://schemas.openxmlformats.org/officeDocument/2006/relationships" xmlns:m="http://schemas.openxmlformats.org/officeDocument/2006/math" xmlns:v="urn:schemas-microsoft-com:vml" xmlns:wp14="http://schemas.microsoft.com/office/word/2010/wordprocessingDrawing" xmlns:wp="http://schemas.openxmlformats.org/drawingml/2006/wordprocessingDrawing" xmlns:w10="urn:schemas-microsoft-com:office:word" xmlns:w="http://schemas.openxmlformats.org/wordprocessingml/2006/main" xmlns:w14="http://schemas.microsoft.com/office/word/2010/wordml" xmlns:wpg="http://schemas.microsoft.com/office/word/2010/wordprocessingGroup" xmlns:wpi="http://schemas.microsoft.com/office/word/2010/wordprocessingInk" xmlns:wne="http://schemas.microsoft.com/office/word/2006/wordml" xmlns:wps="http://schemas.microsoft.com/office/word/2010/wordprocessingShape" mc:Ignorable="w14 wp14">
+<w:endnotes xmlns:wpc="http://schemas.microsoft.com/office/word/2010/wordprocessingCanvas" xmlns:cx="http://schemas.microsoft.com/office/drawing/2014/chartex" xmlns:cx1="http://schemas.microsoft.com/office/drawing/2015/9/8/chartex" xmlns:cx2="http://schemas.microsoft.com/office/drawing/2015/10/21/chartex" xmlns:cx3="http://schemas.microsoft.com/office/drawing/2016/5/9/chartex" xmlns:cx4="http://schemas.microsoft.com/office/drawing/2016/5/10/chartex" xmlns:cx5="http://schemas.microsoft.com/office/drawing/2016/5/11/chartex" xmlns:cx6="http://schemas.microsoft.com/office/drawing/2016/5/12/chartex" xmlns:cx7="http://schemas.microsoft.com/office/drawing/2016/5/13/chartex" xmlns:cx8="http://schemas.microsoft.com/office/drawing/2016/5/14/chartex" xmlns:mc="http://schemas.openxmlformats.org/markup-compatibility/2006" xmlns:aink="http://schemas.microsoft.com/office/drawing/2016/ink" xmlns:am3d="http://schemas.microsoft.com/office/drawing/2017/model3d" xmlns:o="urn:schemas-microsoft-com:office:office" xmlns:r="http://schemas.openxmlformats.org/officeDocument/2006/relationships" xmlns:m="http://schemas.openxmlformats.org/officeDocument/2006/math" xmlns:v="urn:schemas-microsoft-com:vml" xmlns:wp14="http://schemas.microsoft.com/office/word/2010/wordprocessingDrawing" xmlns:wp="http://schemas.openxmlformats.org/drawingml/2006/wordprocessingDrawing" xmlns:w10="urn:schemas-microsoft-com:office:word" xmlns:w="http://schemas.openxmlformats.org/wordprocessingml/2006/main" xmlns:w14="http://schemas.microsoft.com/office/word/2010/wordml" xmlns:w15="http://schemas.microsoft.com/office/word/2012/wordml" xmlns:w16cex="http://schemas.microsoft.com/office/word/2018/wordml/cex" xmlns:w16cid="http://schemas.microsoft.com/office/word/2016/wordml/cid" xmlns:w16="http://schemas.microsoft.com/office/word/2018/wordml" xmlns:w16sdtdh="http://schemas.microsoft.com/office/word/2020/wordml/sdtdatahash" xmlns:w16se="http://schemas.microsoft.com/office/word/2015/wordml/symex" xmlns:wpg="http://schemas.microsoft.com/office/word/2010/wordprocessingGroup" xmlns:wpi="http://schemas.microsoft.com/office/word/2010/wordprocessingInk" xmlns:wne="http://schemas.microsoft.com/office/word/2006/wordml" xmlns:wps="http://schemas.microsoft.com/office/word/2010/wordprocessingShape" mc:Ignorable="w14 w15 w16se w16cid w16 w16cex w16sdtdh wp14">
   <w:endnote w:type="separator" w:id="-1">
     <w:p>
       <w:pPr>
@@ -2261,7 +2403,7 @@
 </file>
 
 <file path=word/footer1.xml><?xml version="1.0" encoding="utf-8"?>
-<w:ftr xmlns:wpc="http://schemas.microsoft.com/office/word/2010/wordprocessingCanvas" xmlns:mc="http://schemas.openxmlformats.org/markup-compatibility/2006" xmlns:o="urn:schemas-microsoft-com:office:office" xmlns:r="http://schemas.openxmlformats.org/officeDocument/2006/relationships" xmlns:m="http://schemas.openxmlformats.org/officeDocument/2006/math" xmlns:v="urn:schemas-microsoft-com:vml" xmlns:wp14="http://schemas.microsoft.com/office/word/2010/wordprocessingDrawing" xmlns:wp="http://schemas.openxmlformats.org/drawingml/2006/wordprocessingDrawing" xmlns:w10="urn:schemas-microsoft-com:office:word" xmlns:w="http://schemas.openxmlformats.org/wordprocessingml/2006/main" xmlns:w14="http://schemas.microsoft.com/office/word/2010/wordml" xmlns:wpg="http://schemas.microsoft.com/office/word/2010/wordprocessingGroup" xmlns:wpi="http://schemas.microsoft.com/office/word/2010/wordprocessingInk" xmlns:wne="http://schemas.microsoft.com/office/word/2006/wordml" xmlns:wps="http://schemas.microsoft.com/office/word/2010/wordprocessingShape" mc:Ignorable="w14 wp14">
+<w:ftr xmlns:wpc="http://schemas.microsoft.com/office/word/2010/wordprocessingCanvas" xmlns:cx="http://schemas.microsoft.com/office/drawing/2014/chartex" xmlns:cx1="http://schemas.microsoft.com/office/drawing/2015/9/8/chartex" xmlns:cx2="http://schemas.microsoft.com/office/drawing/2015/10/21/chartex" xmlns:cx3="http://schemas.microsoft.com/office/drawing/2016/5/9/chartex" xmlns:cx4="http://schemas.microsoft.com/office/drawing/2016/5/10/chartex" xmlns:cx5="http://schemas.microsoft.com/office/drawing/2016/5/11/chartex" xmlns:cx6="http://schemas.microsoft.com/office/drawing/2016/5/12/chartex" xmlns:cx7="http://schemas.microsoft.com/office/drawing/2016/5/13/chartex" xmlns:cx8="http://schemas.microsoft.com/office/drawing/2016/5/14/chartex" xmlns:mc="http://schemas.openxmlformats.org/markup-compatibility/2006" xmlns:aink="http://schemas.microsoft.com/office/drawing/2016/ink" xmlns:am3d="http://schemas.microsoft.com/office/drawing/2017/model3d" xmlns:o="urn:schemas-microsoft-com:office:office" xmlns:r="http://schemas.openxmlformats.org/officeDocument/2006/relationships" xmlns:m="http://schemas.openxmlformats.org/officeDocument/2006/math" xmlns:v="urn:schemas-microsoft-com:vml" xmlns:wp14="http://schemas.microsoft.com/office/word/2010/wordprocessingDrawing" xmlns:wp="http://schemas.openxmlformats.org/drawingml/2006/wordprocessingDrawing" xmlns:w10="urn:schemas-microsoft-com:office:word" xmlns:w="http://schemas.openxmlformats.org/wordprocessingml/2006/main" xmlns:w14="http://schemas.microsoft.com/office/word/2010/wordml" xmlns:w15="http://schemas.microsoft.com/office/word/2012/wordml" xmlns:w16cex="http://schemas.microsoft.com/office/word/2018/wordml/cex" xmlns:w16cid="http://schemas.microsoft.com/office/word/2016/wordml/cid" xmlns:w16="http://schemas.microsoft.com/office/word/2018/wordml" xmlns:w16sdtdh="http://schemas.microsoft.com/office/word/2020/wordml/sdtdatahash" xmlns:w16se="http://schemas.microsoft.com/office/word/2015/wordml/symex" xmlns:wpg="http://schemas.microsoft.com/office/word/2010/wordprocessingGroup" xmlns:wpi="http://schemas.microsoft.com/office/word/2010/wordprocessingInk" xmlns:wne="http://schemas.microsoft.com/office/word/2006/wordml" xmlns:wps="http://schemas.microsoft.com/office/word/2010/wordprocessingShape" mc:Ignorable="w14 w15 w16se w16cid w16 w16cex w16sdtdh wp14">
   <w:p>
     <w:pPr>
       <w:bidi/>
@@ -2291,7 +2433,7 @@
 </file>
 
 <file path=word/footnotes.xml><?xml version="1.0" encoding="utf-8"?>
-<w:footnotes xmlns:wpc="http://schemas.microsoft.com/office/word/2010/wordprocessingCanvas" xmlns:mc="http://schemas.openxmlformats.org/markup-compatibility/2006" xmlns:o="urn:schemas-microsoft-com:office:office" xmlns:r="http://schemas.openxmlformats.org/officeDocument/2006/relationships" xmlns:m="http://schemas.openxmlformats.org/officeDocument/2006/math" xmlns:v="urn:schemas-microsoft-com:vml" xmlns:wp14="http://schemas.microsoft.com/office/word/2010/wordprocessingDrawing" xmlns:wp="http://schemas.openxmlformats.org/drawingml/2006/wordprocessingDrawing" xmlns:w10="urn:schemas-microsoft-com:office:word" xmlns:w="http://schemas.openxmlformats.org/wordprocessingml/2006/main" xmlns:w14="http://schemas.microsoft.com/office/word/2010/wordml" xmlns:wpg="http://schemas.microsoft.com/office/word/2010/wordprocessingGroup" xmlns:wpi="http://schemas.microsoft.com/office/word/2010/wordprocessingInk" xmlns:wne="http://schemas.microsoft.com/office/word/2006/wordml" xmlns:wps="http://schemas.microsoft.com/office/word/2010/wordprocessingShape" mc:Ignorable="w14 wp14">
+<w:footnotes xmlns:wpc="http://schemas.microsoft.com/office/word/2010/wordprocessingCanvas" xmlns:cx="http://schemas.microsoft.com/office/drawing/2014/chartex" xmlns:cx1="http://schemas.microsoft.com/office/drawing/2015/9/8/chartex" xmlns:cx2="http://schemas.microsoft.com/office/drawing/2015/10/21/chartex" xmlns:cx3="http://schemas.microsoft.com/office/drawing/2016/5/9/chartex" xmlns:cx4="http://schemas.microsoft.com/office/drawing/2016/5/10/chartex" xmlns:cx5="http://schemas.microsoft.com/office/drawing/2016/5/11/chartex" xmlns:cx6="http://schemas.microsoft.com/office/drawing/2016/5/12/chartex" xmlns:cx7="http://schemas.microsoft.com/office/drawing/2016/5/13/chartex" xmlns:cx8="http://schemas.microsoft.com/office/drawing/2016/5/14/chartex" xmlns:mc="http://schemas.openxmlformats.org/markup-compatibility/2006" xmlns:aink="http://schemas.microsoft.com/office/drawing/2016/ink" xmlns:am3d="http://schemas.microsoft.com/office/drawing/2017/model3d" xmlns:o="urn:schemas-microsoft-com:office:office" xmlns:r="http://schemas.openxmlformats.org/officeDocument/2006/relationships" xmlns:m="http://schemas.openxmlformats.org/officeDocument/2006/math" xmlns:v="urn:schemas-microsoft-com:vml" xmlns:wp14="http://schemas.microsoft.com/office/word/2010/wordprocessingDrawing" xmlns:wp="http://schemas.openxmlformats.org/drawingml/2006/wordprocessingDrawing" xmlns:w10="urn:schemas-microsoft-com:office:word" xmlns:w="http://schemas.openxmlformats.org/wordprocessingml/2006/main" xmlns:w14="http://schemas.microsoft.com/office/word/2010/wordml" xmlns:w15="http://schemas.microsoft.com/office/word/2012/wordml" xmlns:w16cex="http://schemas.microsoft.com/office/word/2018/wordml/cex" xmlns:w16cid="http://schemas.microsoft.com/office/word/2016/wordml/cid" xmlns:w16="http://schemas.microsoft.com/office/word/2018/wordml" xmlns:w16sdtdh="http://schemas.microsoft.com/office/word/2020/wordml/sdtdatahash" xmlns:w16se="http://schemas.microsoft.com/office/word/2015/wordml/symex" xmlns:wpg="http://schemas.microsoft.com/office/word/2010/wordprocessingGroup" xmlns:wpi="http://schemas.microsoft.com/office/word/2010/wordprocessingInk" xmlns:wne="http://schemas.microsoft.com/office/word/2006/wordml" xmlns:wps="http://schemas.microsoft.com/office/word/2010/wordprocessingShape" mc:Ignorable="w14 w15 w16se w16cid w16 w16cex w16sdtdh wp14">
   <w:footnote w:type="separator" w:id="-1">
     <w:p>
       <w:pPr>
@@ -2316,7 +2458,7 @@
 </file>
 
 <file path=word/header1.xml><?xml version="1.0" encoding="utf-8"?>
-<w:hdr xmlns:wpc="http://schemas.microsoft.com/office/word/2010/wordprocessingCanvas" xmlns:mc="http://schemas.openxmlformats.org/markup-compatibility/2006" xmlns:o="urn:schemas-microsoft-com:office:office" xmlns:r="http://schemas.openxmlformats.org/officeDocument/2006/relationships" xmlns:m="http://schemas.openxmlformats.org/officeDocument/2006/math" xmlns:v="urn:schemas-microsoft-com:vml" xmlns:wp14="http://schemas.microsoft.com/office/word/2010/wordprocessingDrawing" xmlns:wp="http://schemas.openxmlformats.org/drawingml/2006/wordprocessingDrawing" xmlns:w10="urn:schemas-microsoft-com:office:word" xmlns:w="http://schemas.openxmlformats.org/wordprocessingml/2006/main" xmlns:w14="http://schemas.microsoft.com/office/word/2010/wordml" xmlns:wpg="http://schemas.microsoft.com/office/word/2010/wordprocessingGroup" xmlns:wpi="http://schemas.microsoft.com/office/word/2010/wordprocessingInk" xmlns:wne="http://schemas.microsoft.com/office/word/2006/wordml" xmlns:wps="http://schemas.microsoft.com/office/word/2010/wordprocessingShape" mc:Ignorable="w14 wp14">
+<w:hdr xmlns:wpc="http://schemas.microsoft.com/office/word/2010/wordprocessingCanvas" xmlns:cx="http://schemas.microsoft.com/office/drawing/2014/chartex" xmlns:cx1="http://schemas.microsoft.com/office/drawing/2015/9/8/chartex" xmlns:cx2="http://schemas.microsoft.com/office/drawing/2015/10/21/chartex" xmlns:cx3="http://schemas.microsoft.com/office/drawing/2016/5/9/chartex" xmlns:cx4="http://schemas.microsoft.com/office/drawing/2016/5/10/chartex" xmlns:cx5="http://schemas.microsoft.com/office/drawing/2016/5/11/chartex" xmlns:cx6="http://schemas.microsoft.com/office/drawing/2016/5/12/chartex" xmlns:cx7="http://schemas.microsoft.com/office/drawing/2016/5/13/chartex" xmlns:cx8="http://schemas.microsoft.com/office/drawing/2016/5/14/chartex" xmlns:mc="http://schemas.openxmlformats.org/markup-compatibility/2006" xmlns:aink="http://schemas.microsoft.com/office/drawing/2016/ink" xmlns:am3d="http://schemas.microsoft.com/office/drawing/2017/model3d" xmlns:o="urn:schemas-microsoft-com:office:office" xmlns:r="http://schemas.openxmlformats.org/officeDocument/2006/relationships" xmlns:m="http://schemas.openxmlformats.org/officeDocument/2006/math" xmlns:v="urn:schemas-microsoft-com:vml" xmlns:wp14="http://schemas.microsoft.com/office/word/2010/wordprocessingDrawing" xmlns:wp="http://schemas.openxmlformats.org/drawingml/2006/wordprocessingDrawing" xmlns:w10="urn:schemas-microsoft-com:office:word" xmlns:w="http://schemas.openxmlformats.org/wordprocessingml/2006/main" xmlns:w14="http://schemas.microsoft.com/office/word/2010/wordml" xmlns:w15="http://schemas.microsoft.com/office/word/2012/wordml" xmlns:w16cex="http://schemas.microsoft.com/office/word/2018/wordml/cex" xmlns:w16cid="http://schemas.microsoft.com/office/word/2016/wordml/cid" xmlns:w16="http://schemas.microsoft.com/office/word/2018/wordml" xmlns:w16sdtdh="http://schemas.microsoft.com/office/word/2020/wordml/sdtdatahash" xmlns:w16se="http://schemas.microsoft.com/office/word/2015/wordml/symex" xmlns:wpg="http://schemas.microsoft.com/office/word/2010/wordprocessingGroup" xmlns:wpi="http://schemas.microsoft.com/office/word/2010/wordprocessingInk" xmlns:wne="http://schemas.microsoft.com/office/word/2006/wordml" xmlns:wps="http://schemas.microsoft.com/office/word/2010/wordprocessingShape" mc:Ignorable="w14 w15 w16se w16cid w16 w16cex w16sdtdh wp14">
   <w:p>
     <w:pPr>
       <w:bidi/>
@@ -2379,22 +2521,15 @@
         <w:rtl/>
       </w:rPr>
       <w:tab/>
-      <w:t>תאריך עדכון אחרון</w:t>
-    </w:r>
-    <w:r>
-      <w:rPr>
-        <w:color w:val="B7B7B7"/>
-        <w:rtl/>
-      </w:rPr>
-      <w:t xml:space="preserve"> 28.10.17</w:t>
+      <w:t>תאריך עדכון אחרון 28.10.17</w:t>
     </w:r>
   </w:p>
 </w:hdr>
 </file>
 
 <file path=word/numbering.xml><?xml version="1.0" encoding="utf-8"?>
-<w:numbering xmlns:wpc="http://schemas.microsoft.com/office/word/2010/wordprocessingCanvas" xmlns:mc="http://schemas.openxmlformats.org/markup-compatibility/2006" xmlns:o="urn:schemas-microsoft-com:office:office" xmlns:r="http://schemas.openxmlformats.org/officeDocument/2006/relationships" xmlns:m="http://schemas.openxmlformats.org/officeDocument/2006/math" xmlns:v="urn:schemas-microsoft-com:vml" xmlns:wp14="http://schemas.microsoft.com/office/word/2010/wordprocessingDrawing" xmlns:wp="http://schemas.openxmlformats.org/drawingml/2006/wordprocessingDrawing" xmlns:w10="urn:schemas-microsoft-com:office:word" xmlns:w="http://schemas.openxmlformats.org/wordprocessingml/2006/main" xmlns:w14="http://schemas.microsoft.com/office/word/2010/wordml" xmlns:wpg="http://schemas.microsoft.com/office/word/2010/wordprocessingGroup" xmlns:wpi="http://schemas.microsoft.com/office/word/2010/wordprocessingInk" xmlns:wne="http://schemas.microsoft.com/office/word/2006/wordml" xmlns:wps="http://schemas.microsoft.com/office/word/2010/wordprocessingShape" mc:Ignorable="w14 wp14">
-  <w:abstractNum w:abstractNumId="0">
+<w:numbering xmlns:wpc="http://schemas.microsoft.com/office/word/2010/wordprocessingCanvas" xmlns:cx="http://schemas.microsoft.com/office/drawing/2014/chartex" xmlns:cx1="http://schemas.microsoft.com/office/drawing/2015/9/8/chartex" xmlns:cx2="http://schemas.microsoft.com/office/drawing/2015/10/21/chartex" xmlns:cx3="http://schemas.microsoft.com/office/drawing/2016/5/9/chartex" xmlns:cx4="http://schemas.microsoft.com/office/drawing/2016/5/10/chartex" xmlns:cx5="http://schemas.microsoft.com/office/drawing/2016/5/11/chartex" xmlns:cx6="http://schemas.microsoft.com/office/drawing/2016/5/12/chartex" xmlns:cx7="http://schemas.microsoft.com/office/drawing/2016/5/13/chartex" xmlns:cx8="http://schemas.microsoft.com/office/drawing/2016/5/14/chartex" xmlns:mc="http://schemas.openxmlformats.org/markup-compatibility/2006" xmlns:aink="http://schemas.microsoft.com/office/drawing/2016/ink" xmlns:am3d="http://schemas.microsoft.com/office/drawing/2017/model3d" xmlns:o="urn:schemas-microsoft-com:office:office" xmlns:r="http://schemas.openxmlformats.org/officeDocument/2006/relationships" xmlns:m="http://schemas.openxmlformats.org/officeDocument/2006/math" xmlns:v="urn:schemas-microsoft-com:vml" xmlns:wp14="http://schemas.microsoft.com/office/word/2010/wordprocessingDrawing" xmlns:wp="http://schemas.openxmlformats.org/drawingml/2006/wordprocessingDrawing" xmlns:w10="urn:schemas-microsoft-com:office:word" xmlns:w="http://schemas.openxmlformats.org/wordprocessingml/2006/main" xmlns:w14="http://schemas.microsoft.com/office/word/2010/wordml" xmlns:w15="http://schemas.microsoft.com/office/word/2012/wordml" xmlns:w16cex="http://schemas.microsoft.com/office/word/2018/wordml/cex" xmlns:w16cid="http://schemas.microsoft.com/office/word/2016/wordml/cid" xmlns:w16="http://schemas.microsoft.com/office/word/2018/wordml" xmlns:w16sdtdh="http://schemas.microsoft.com/office/word/2020/wordml/sdtdatahash" xmlns:w16se="http://schemas.microsoft.com/office/word/2015/wordml/symex" xmlns:wpg="http://schemas.microsoft.com/office/word/2010/wordprocessingGroup" xmlns:wpi="http://schemas.microsoft.com/office/word/2010/wordprocessingInk" xmlns:wne="http://schemas.microsoft.com/office/word/2006/wordml" xmlns:wps="http://schemas.microsoft.com/office/word/2010/wordprocessingShape" mc:Ignorable="w14 w15 w16se w16cid w16 w16cex w16sdtdh wp14">
+  <w:abstractNum w:abstractNumId="0" w15:restartNumberingAfterBreak="0">
     <w:nsid w:val="22930F7C"/>
     <w:multiLevelType w:val="multilevel"/>
     <w:tmpl w:val="561E2706"/>
@@ -2507,7 +2642,7 @@
       </w:rPr>
     </w:lvl>
   </w:abstractNum>
-  <w:abstractNum w:abstractNumId="1">
+  <w:abstractNum w:abstractNumId="1" w15:restartNumberingAfterBreak="0">
     <w:nsid w:val="27536384"/>
     <w:multiLevelType w:val="multilevel"/>
     <w:tmpl w:val="0312029A"/>
@@ -2620,7 +2755,7 @@
       </w:rPr>
     </w:lvl>
   </w:abstractNum>
-  <w:abstractNum w:abstractNumId="2">
+  <w:abstractNum w:abstractNumId="2" w15:restartNumberingAfterBreak="0">
     <w:nsid w:val="2A6A564B"/>
     <w:multiLevelType w:val="multilevel"/>
     <w:tmpl w:val="8E8631B0"/>
@@ -2746,7 +2881,7 @@
 </file>
 
 <file path=word/styles.xml><?xml version="1.0" encoding="utf-8"?>
-<w:styles xmlns:mc="http://schemas.openxmlformats.org/markup-compatibility/2006" xmlns:r="http://schemas.openxmlformats.org/officeDocument/2006/relationships" xmlns:w="http://schemas.openxmlformats.org/wordprocessingml/2006/main" xmlns:w14="http://schemas.microsoft.com/office/word/2010/wordml" mc:Ignorable="w14">
+<w:styles xmlns:mc="http://schemas.openxmlformats.org/markup-compatibility/2006" xmlns:r="http://schemas.openxmlformats.org/officeDocument/2006/relationships" xmlns:w="http://schemas.openxmlformats.org/wordprocessingml/2006/main" xmlns:w14="http://schemas.microsoft.com/office/word/2010/wordml" xmlns:w15="http://schemas.microsoft.com/office/word/2012/wordml" xmlns:w16cex="http://schemas.microsoft.com/office/word/2018/wordml/cex" xmlns:w16cid="http://schemas.microsoft.com/office/word/2016/wordml/cid" xmlns:w16="http://schemas.microsoft.com/office/word/2018/wordml" xmlns:w16sdtdh="http://schemas.microsoft.com/office/word/2020/wordml/sdtdatahash" xmlns:w16se="http://schemas.microsoft.com/office/word/2015/wordml/symex" mc:Ignorable="w14 w15 w16se w16cid w16 w16cex w16sdtdh">
   <w:docDefaults>
     <w:rPrDefault>
       <w:rPr>
@@ -2770,152 +2905,391 @@
       </w:pPr>
     </w:pPrDefault>
   </w:docDefaults>
-  <w:latentStyles w:defLockedState="0" w:defUIPriority="99" w:defSemiHidden="1" w:defUnhideWhenUsed="1" w:defQFormat="0" w:count="267">
-    <w:lsdException w:name="Normal" w:semiHidden="0" w:uiPriority="0" w:unhideWhenUsed="0" w:qFormat="1"/>
-    <w:lsdException w:name="heading 1" w:semiHidden="0" w:uiPriority="9" w:unhideWhenUsed="0" w:qFormat="1"/>
-    <w:lsdException w:name="heading 2" w:uiPriority="9" w:qFormat="1"/>
-    <w:lsdException w:name="heading 3" w:uiPriority="9" w:qFormat="1"/>
-    <w:lsdException w:name="heading 4" w:uiPriority="9" w:qFormat="1"/>
-    <w:lsdException w:name="heading 5" w:uiPriority="9" w:qFormat="1"/>
-    <w:lsdException w:name="heading 6" w:uiPriority="9" w:qFormat="1"/>
-    <w:lsdException w:name="heading 7" w:uiPriority="9" w:qFormat="1"/>
-    <w:lsdException w:name="heading 8" w:uiPriority="9" w:qFormat="1"/>
-    <w:lsdException w:name="heading 9" w:uiPriority="9" w:qFormat="1"/>
-    <w:lsdException w:name="toc 1" w:uiPriority="39"/>
-    <w:lsdException w:name="toc 2" w:uiPriority="39"/>
-    <w:lsdException w:name="toc 3" w:uiPriority="39"/>
-    <w:lsdException w:name="toc 4" w:uiPriority="39"/>
-    <w:lsdException w:name="toc 5" w:uiPriority="39"/>
-    <w:lsdException w:name="toc 6" w:uiPriority="39"/>
-    <w:lsdException w:name="toc 7" w:uiPriority="39"/>
-    <w:lsdException w:name="toc 8" w:uiPriority="39"/>
-    <w:lsdException w:name="toc 9" w:uiPriority="39"/>
-    <w:lsdException w:name="caption" w:uiPriority="35" w:qFormat="1"/>
-    <w:lsdException w:name="Title" w:semiHidden="0" w:uiPriority="10" w:unhideWhenUsed="0" w:qFormat="1"/>
-    <w:lsdException w:name="Default Paragraph Font" w:uiPriority="1"/>
-    <w:lsdException w:name="Subtitle" w:semiHidden="0" w:uiPriority="11" w:unhideWhenUsed="0" w:qFormat="1"/>
-    <w:lsdException w:name="Strong" w:semiHidden="0" w:uiPriority="22" w:unhideWhenUsed="0" w:qFormat="1"/>
-    <w:lsdException w:name="Emphasis" w:semiHidden="0" w:uiPriority="20" w:unhideWhenUsed="0" w:qFormat="1"/>
-    <w:lsdException w:name="Table Grid" w:semiHidden="0" w:uiPriority="59" w:unhideWhenUsed="0"/>
-    <w:lsdException w:name="Placeholder Text" w:unhideWhenUsed="0"/>
-    <w:lsdException w:name="No Spacing" w:semiHidden="0" w:uiPriority="1" w:unhideWhenUsed="0" w:qFormat="1"/>
-    <w:lsdException w:name="Light Shading" w:semiHidden="0" w:uiPriority="60" w:unhideWhenUsed="0"/>
-    <w:lsdException w:name="Light List" w:semiHidden="0" w:uiPriority="61" w:unhideWhenUsed="0"/>
-    <w:lsdException w:name="Light Grid" w:semiHidden="0" w:uiPriority="62" w:unhideWhenUsed="0"/>
-    <w:lsdException w:name="Medium Shading 1" w:semiHidden="0" w:uiPriority="63" w:unhideWhenUsed="0"/>
-    <w:lsdException w:name="Medium Shading 2" w:semiHidden="0" w:uiPriority="64" w:unhideWhenUsed="0"/>
-    <w:lsdException w:name="Medium List 1" w:semiHidden="0" w:uiPriority="65" w:unhideWhenUsed="0"/>
-    <w:lsdException w:name="Medium List 2" w:semiHidden="0" w:uiPriority="66" w:unhideWhenUsed="0"/>
-    <w:lsdException w:name="Medium Grid 1" w:semiHidden="0" w:uiPriority="67" w:unhideWhenUsed="0"/>
-    <w:lsdException w:name="Medium Grid 2" w:semiHidden="0" w:uiPriority="68" w:unhideWhenUsed="0"/>
-    <w:lsdException w:name="Medium Grid 3" w:semiHidden="0" w:uiPriority="69" w:unhideWhenUsed="0"/>
-    <w:lsdException w:name="Dark List" w:semiHidden="0" w:uiPriority="70" w:unhideWhenUsed="0"/>
-    <w:lsdException w:name="Colorful Shading" w:semiHidden="0" w:uiPriority="71" w:unhideWhenUsed="0"/>
-    <w:lsdException w:name="Colorful List" w:semiHidden="0" w:uiPriority="72" w:unhideWhenUsed="0"/>
-    <w:lsdException w:name="Colorful Grid" w:semiHidden="0" w:uiPriority="73" w:unhideWhenUsed="0"/>
-    <w:lsdException w:name="Light Shading Accent 1" w:semiHidden="0" w:uiPriority="60" w:unhideWhenUsed="0"/>
-    <w:lsdException w:name="Light List Accent 1" w:semiHidden="0" w:uiPriority="61" w:unhideWhenUsed="0"/>
-    <w:lsdException w:name="Light Grid Accent 1" w:semiHidden="0" w:uiPriority="62" w:unhideWhenUsed="0"/>
-    <w:lsdException w:name="Medium Shading 1 Accent 1" w:semiHidden="0" w:uiPriority="63" w:unhideWhenUsed="0"/>
-    <w:lsdException w:name="Medium Shading 2 Accent 1" w:semiHidden="0" w:uiPriority="64" w:unhideWhenUsed="0"/>
-    <w:lsdException w:name="Medium List 1 Accent 1" w:semiHidden="0" w:uiPriority="65" w:unhideWhenUsed="0"/>
-    <w:lsdException w:name="Revision" w:unhideWhenUsed="0"/>
-    <w:lsdException w:name="List Paragraph" w:semiHidden="0" w:uiPriority="34" w:unhideWhenUsed="0" w:qFormat="1"/>
-    <w:lsdException w:name="Quote" w:semiHidden="0" w:uiPriority="29" w:unhideWhenUsed="0" w:qFormat="1"/>
-    <w:lsdException w:name="Intense Quote" w:semiHidden="0" w:uiPriority="30" w:unhideWhenUsed="0" w:qFormat="1"/>
-    <w:lsdException w:name="Medium List 2 Accent 1" w:semiHidden="0" w:uiPriority="66" w:unhideWhenUsed="0"/>
-    <w:lsdException w:name="Medium Grid 1 Accent 1" w:semiHidden="0" w:uiPriority="67" w:unhideWhenUsed="0"/>
-    <w:lsdException w:name="Medium Grid 2 Accent 1" w:semiHidden="0" w:uiPriority="68" w:unhideWhenUsed="0"/>
-    <w:lsdException w:name="Medium Grid 3 Accent 1" w:semiHidden="0" w:uiPriority="69" w:unhideWhenUsed="0"/>
-    <w:lsdException w:name="Dark List Accent 1" w:semiHidden="0" w:uiPriority="70" w:unhideWhenUsed="0"/>
-    <w:lsdException w:name="Colorful Shading Accent 1" w:semiHidden="0" w:uiPriority="71" w:unhideWhenUsed="0"/>
-    <w:lsdException w:name="Colorful List Accent 1" w:semiHidden="0" w:uiPriority="72" w:unhideWhenUsed="0"/>
-    <w:lsdException w:name="Colorful Grid Accent 1" w:semiHidden="0" w:uiPriority="73" w:unhideWhenUsed="0"/>
-    <w:lsdException w:name="Light Shading Accent 2" w:semiHidden="0" w:uiPriority="60" w:unhideWhenUsed="0"/>
-    <w:lsdException w:name="Light List Accent 2" w:semiHidden="0" w:uiPriority="61" w:unhideWhenUsed="0"/>
-    <w:lsdException w:name="Light Grid Accent 2" w:semiHidden="0" w:uiPriority="62" w:unhideWhenUsed="0"/>
-    <w:lsdException w:name="Medium Shading 1 Accent 2" w:semiHidden="0" w:uiPriority="63" w:unhideWhenUsed="0"/>
-    <w:lsdException w:name="Medium Shading 2 Accent 2" w:semiHidden="0" w:uiPriority="64" w:unhideWhenUsed="0"/>
-    <w:lsdException w:name="Medium List 1 Accent 2" w:semiHidden="0" w:uiPriority="65" w:unhideWhenUsed="0"/>
-    <w:lsdException w:name="Medium List 2 Accent 2" w:semiHidden="0" w:uiPriority="66" w:unhideWhenUsed="0"/>
-    <w:lsdException w:name="Medium Grid 1 Accent 2" w:semiHidden="0" w:uiPriority="67" w:unhideWhenUsed="0"/>
-    <w:lsdException w:name="Medium Grid 2 Accent 2" w:semiHidden="0" w:uiPriority="68" w:unhideWhenUsed="0"/>
-    <w:lsdException w:name="Medium Grid 3 Accent 2" w:semiHidden="0" w:uiPriority="69" w:unhideWhenUsed="0"/>
-    <w:lsdException w:name="Dark List Accent 2" w:semiHidden="0" w:uiPriority="70" w:unhideWhenUsed="0"/>
-    <w:lsdException w:name="Colorful Shading Accent 2" w:semiHidden="0" w:uiPriority="71" w:unhideWhenUsed="0"/>
-    <w:lsdException w:name="Colorful List Accent 2" w:semiHidden="0" w:uiPriority="72" w:unhideWhenUsed="0"/>
-    <w:lsdException w:name="Colorful Grid Accent 2" w:semiHidden="0" w:uiPriority="73" w:unhideWhenUsed="0"/>
-    <w:lsdException w:name="Light Shading Accent 3" w:semiHidden="0" w:uiPriority="60" w:unhideWhenUsed="0"/>
-    <w:lsdException w:name="Light List Accent 3" w:semiHidden="0" w:uiPriority="61" w:unhideWhenUsed="0"/>
-    <w:lsdException w:name="Light Grid Accent 3" w:semiHidden="0" w:uiPriority="62" w:unhideWhenUsed="0"/>
-    <w:lsdException w:name="Medium Shading 1 Accent 3" w:semiHidden="0" w:uiPriority="63" w:unhideWhenUsed="0"/>
-    <w:lsdException w:name="Medium Shading 2 Accent 3" w:semiHidden="0" w:uiPriority="64" w:unhideWhenUsed="0"/>
-    <w:lsdException w:name="Medium List 1 Accent 3" w:semiHidden="0" w:uiPriority="65" w:unhideWhenUsed="0"/>
-    <w:lsdException w:name="Medium List 2 Accent 3" w:semiHidden="0" w:uiPriority="66" w:unhideWhenUsed="0"/>
-    <w:lsdException w:name="Medium Grid 1 Accent 3" w:semiHidden="0" w:uiPriority="67" w:unhideWhenUsed="0"/>
-    <w:lsdException w:name="Medium Grid 2 Accent 3" w:semiHidden="0" w:uiPriority="68" w:unhideWhenUsed="0"/>
-    <w:lsdException w:name="Medium Grid 3 Accent 3" w:semiHidden="0" w:uiPriority="69" w:unhideWhenUsed="0"/>
-    <w:lsdException w:name="Dark List Accent 3" w:semiHidden="0" w:uiPriority="70" w:unhideWhenUsed="0"/>
-    <w:lsdException w:name="Colorful Shading Accent 3" w:semiHidden="0" w:uiPriority="71" w:unhideWhenUsed="0"/>
-    <w:lsdException w:name="Colorful List Accent 3" w:semiHidden="0" w:uiPriority="72" w:unhideWhenUsed="0"/>
-    <w:lsdException w:name="Colorful Grid Accent 3" w:semiHidden="0" w:uiPriority="73" w:unhideWhenUsed="0"/>
-    <w:lsdException w:name="Light Shading Accent 4" w:semiHidden="0" w:uiPriority="60" w:unhideWhenUsed="0"/>
-    <w:lsdException w:name="Light List Accent 4" w:semiHidden="0" w:uiPriority="61" w:unhideWhenUsed="0"/>
-    <w:lsdException w:name="Light Grid Accent 4" w:semiHidden="0" w:uiPriority="62" w:unhideWhenUsed="0"/>
-    <w:lsdException w:name="Medium Shading 1 Accent 4" w:semiHidden="0" w:uiPriority="63" w:unhideWhenUsed="0"/>
-    <w:lsdException w:name="Medium Shading 2 Accent 4" w:semiHidden="0" w:uiPriority="64" w:unhideWhenUsed="0"/>
-    <w:lsdException w:name="Medium List 1 Accent 4" w:semiHidden="0" w:uiPriority="65" w:unhideWhenUsed="0"/>
-    <w:lsdException w:name="Medium List 2 Accent 4" w:semiHidden="0" w:uiPriority="66" w:unhideWhenUsed="0"/>
-    <w:lsdException w:name="Medium Grid 1 Accent 4" w:semiHidden="0" w:uiPriority="67" w:unhideWhenUsed="0"/>
-    <w:lsdException w:name="Medium Grid 2 Accent 4" w:semiHidden="0" w:uiPriority="68" w:unhideWhenUsed="0"/>
-    <w:lsdException w:name="Medium Grid 3 Accent 4" w:semiHidden="0" w:uiPriority="69" w:unhideWhenUsed="0"/>
-    <w:lsdException w:name="Dark List Accent 4" w:semiHidden="0" w:uiPriority="70" w:unhideWhenUsed="0"/>
-    <w:lsdException w:name="Colorful Shading Accent 4" w:semiHidden="0" w:uiPriority="71" w:unhideWhenUsed="0"/>
-    <w:lsdException w:name="Colorful List Accent 4" w:semiHidden="0" w:uiPriority="72" w:unhideWhenUsed="0"/>
-    <w:lsdException w:name="Colorful Grid Accent 4" w:semiHidden="0" w:uiPriority="73" w:unhideWhenUsed="0"/>
-    <w:lsdException w:name="Light Shading Accent 5" w:semiHidden="0" w:uiPriority="60" w:unhideWhenUsed="0"/>
-    <w:lsdException w:name="Light List Accent 5" w:semiHidden="0" w:uiPriority="61" w:unhideWhenUsed="0"/>
-    <w:lsdException w:name="Light Grid Accent 5" w:semiHidden="0" w:uiPriority="62" w:unhideWhenUsed="0"/>
-    <w:lsdException w:name="Medium Shading 1 Accent 5" w:semiHidden="0" w:uiPriority="63" w:unhideWhenUsed="0"/>
-    <w:lsdException w:name="Medium Shading 2 Accent 5" w:semiHidden="0" w:uiPriority="64" w:unhideWhenUsed="0"/>
-    <w:lsdException w:name="Medium List 1 Accent 5" w:semiHidden="0" w:uiPriority="65" w:unhideWhenUsed="0"/>
-    <w:lsdException w:name="Medium List 2 Accent 5" w:semiHidden="0" w:uiPriority="66" w:unhideWhenUsed="0"/>
-    <w:lsdException w:name="Medium Grid 1 Accent 5" w:semiHidden="0" w:uiPriority="67" w:unhideWhenUsed="0"/>
-    <w:lsdException w:name="Medium Grid 2 Accent 5" w:semiHidden="0" w:uiPriority="68" w:unhideWhenUsed="0"/>
-    <w:lsdException w:name="Medium Grid 3 Accent 5" w:semiHidden="0" w:uiPriority="69" w:unhideWhenUsed="0"/>
-    <w:lsdException w:name="Dark List Accent 5" w:semiHidden="0" w:uiPriority="70" w:unhideWhenUsed="0"/>
-    <w:lsdException w:name="Colorful Shading Accent 5" w:semiHidden="0" w:uiPriority="71" w:unhideWhenUsed="0"/>
-    <w:lsdException w:name="Colorful List Accent 5" w:semiHidden="0" w:uiPriority="72" w:unhideWhenUsed="0"/>
-    <w:lsdException w:name="Colorful Grid Accent 5" w:semiHidden="0" w:uiPriority="73" w:unhideWhenUsed="0"/>
-    <w:lsdException w:name="Light Shading Accent 6" w:semiHidden="0" w:uiPriority="60" w:unhideWhenUsed="0"/>
-    <w:lsdException w:name="Light List Accent 6" w:semiHidden="0" w:uiPriority="61" w:unhideWhenUsed="0"/>
-    <w:lsdException w:name="Light Grid Accent 6" w:semiHidden="0" w:uiPriority="62" w:unhideWhenUsed="0"/>
-    <w:lsdException w:name="Medium Shading 1 Accent 6" w:semiHidden="0" w:uiPriority="63" w:unhideWhenUsed="0"/>
-    <w:lsdException w:name="Medium Shading 2 Accent 6" w:semiHidden="0" w:uiPriority="64" w:unhideWhenUsed="0"/>
-    <w:lsdException w:name="Medium List 1 Accent 6" w:semiHidden="0" w:uiPriority="65" w:unhideWhenUsed="0"/>
-    <w:lsdException w:name="Medium List 2 Accent 6" w:semiHidden="0" w:uiPriority="66" w:unhideWhenUsed="0"/>
-    <w:lsdException w:name="Medium Grid 1 Accent 6" w:semiHidden="0" w:uiPriority="67" w:unhideWhenUsed="0"/>
-    <w:lsdException w:name="Medium Grid 2 Accent 6" w:semiHidden="0" w:uiPriority="68" w:unhideWhenUsed="0"/>
-    <w:lsdException w:name="Medium Grid 3 Accent 6" w:semiHidden="0" w:uiPriority="69" w:unhideWhenUsed="0"/>
-    <w:lsdException w:name="Dark List Accent 6" w:semiHidden="0" w:uiPriority="70" w:unhideWhenUsed="0"/>
-    <w:lsdException w:name="Colorful Shading Accent 6" w:semiHidden="0" w:uiPriority="71" w:unhideWhenUsed="0"/>
-    <w:lsdException w:name="Colorful List Accent 6" w:semiHidden="0" w:uiPriority="72" w:unhideWhenUsed="0"/>
-    <w:lsdException w:name="Colorful Grid Accent 6" w:semiHidden="0" w:uiPriority="73" w:unhideWhenUsed="0"/>
-    <w:lsdException w:name="Subtle Emphasis" w:semiHidden="0" w:uiPriority="19" w:unhideWhenUsed="0" w:qFormat="1"/>
-    <w:lsdException w:name="Intense Emphasis" w:semiHidden="0" w:uiPriority="21" w:unhideWhenUsed="0" w:qFormat="1"/>
-    <w:lsdException w:name="Subtle Reference" w:semiHidden="0" w:uiPriority="31" w:unhideWhenUsed="0" w:qFormat="1"/>
-    <w:lsdException w:name="Intense Reference" w:semiHidden="0" w:uiPriority="32" w:unhideWhenUsed="0" w:qFormat="1"/>
-    <w:lsdException w:name="Book Title" w:semiHidden="0" w:uiPriority="33" w:unhideWhenUsed="0" w:qFormat="1"/>
-    <w:lsdException w:name="Bibliography" w:uiPriority="37"/>
-    <w:lsdException w:name="TOC Heading" w:uiPriority="39" w:qFormat="1"/>
+  <w:latentStyles w:defLockedState="0" w:defUIPriority="99" w:defSemiHidden="0" w:defUnhideWhenUsed="0" w:defQFormat="0" w:count="376">
+    <w:lsdException w:name="Normal" w:uiPriority="0" w:qFormat="1"/>
+    <w:lsdException w:name="heading 1" w:uiPriority="9" w:qFormat="1"/>
+    <w:lsdException w:name="heading 2" w:semiHidden="1" w:uiPriority="9" w:unhideWhenUsed="1" w:qFormat="1"/>
+    <w:lsdException w:name="heading 3" w:semiHidden="1" w:uiPriority="9" w:unhideWhenUsed="1" w:qFormat="1"/>
+    <w:lsdException w:name="heading 4" w:semiHidden="1" w:uiPriority="9" w:unhideWhenUsed="1" w:qFormat="1"/>
+    <w:lsdException w:name="heading 5" w:semiHidden="1" w:uiPriority="9" w:unhideWhenUsed="1" w:qFormat="1"/>
+    <w:lsdException w:name="heading 6" w:semiHidden="1" w:uiPriority="9" w:unhideWhenUsed="1" w:qFormat="1"/>
+    <w:lsdException w:name="heading 7" w:semiHidden="1" w:uiPriority="9" w:unhideWhenUsed="1" w:qFormat="1"/>
+    <w:lsdException w:name="heading 8" w:semiHidden="1" w:uiPriority="9" w:unhideWhenUsed="1" w:qFormat="1"/>
+    <w:lsdException w:name="heading 9" w:semiHidden="1" w:uiPriority="9" w:unhideWhenUsed="1" w:qFormat="1"/>
+    <w:lsdException w:name="index 1" w:semiHidden="1" w:unhideWhenUsed="1"/>
+    <w:lsdException w:name="index 2" w:semiHidden="1" w:unhideWhenUsed="1"/>
+    <w:lsdException w:name="index 3" w:semiHidden="1" w:unhideWhenUsed="1"/>
+    <w:lsdException w:name="index 4" w:semiHidden="1" w:unhideWhenUsed="1"/>
+    <w:lsdException w:name="index 5" w:semiHidden="1" w:unhideWhenUsed="1"/>
+    <w:lsdException w:name="index 6" w:semiHidden="1" w:unhideWhenUsed="1"/>
+    <w:lsdException w:name="index 7" w:semiHidden="1" w:unhideWhenUsed="1"/>
+    <w:lsdException w:name="index 8" w:semiHidden="1" w:unhideWhenUsed="1"/>
+    <w:lsdException w:name="index 9" w:semiHidden="1" w:unhideWhenUsed="1"/>
+    <w:lsdException w:name="toc 1" w:semiHidden="1" w:uiPriority="39" w:unhideWhenUsed="1"/>
+    <w:lsdException w:name="toc 2" w:semiHidden="1" w:uiPriority="39" w:unhideWhenUsed="1"/>
+    <w:lsdException w:name="toc 3" w:semiHidden="1" w:uiPriority="39" w:unhideWhenUsed="1"/>
+    <w:lsdException w:name="toc 4" w:semiHidden="1" w:uiPriority="39" w:unhideWhenUsed="1"/>
+    <w:lsdException w:name="toc 5" w:semiHidden="1" w:uiPriority="39" w:unhideWhenUsed="1"/>
+    <w:lsdException w:name="toc 6" w:semiHidden="1" w:uiPriority="39" w:unhideWhenUsed="1"/>
+    <w:lsdException w:name="toc 7" w:semiHidden="1" w:uiPriority="39" w:unhideWhenUsed="1"/>
+    <w:lsdException w:name="toc 8" w:semiHidden="1" w:uiPriority="39" w:unhideWhenUsed="1"/>
+    <w:lsdException w:name="toc 9" w:semiHidden="1" w:uiPriority="39" w:unhideWhenUsed="1"/>
+    <w:lsdException w:name="Normal Indent" w:semiHidden="1" w:unhideWhenUsed="1"/>
+    <w:lsdException w:name="footnote text" w:semiHidden="1" w:unhideWhenUsed="1"/>
+    <w:lsdException w:name="annotation text" w:semiHidden="1" w:unhideWhenUsed="1"/>
+    <w:lsdException w:name="header" w:semiHidden="1" w:unhideWhenUsed="1"/>
+    <w:lsdException w:name="footer" w:semiHidden="1" w:unhideWhenUsed="1"/>
+    <w:lsdException w:name="index heading" w:semiHidden="1" w:unhideWhenUsed="1"/>
+    <w:lsdException w:name="caption" w:semiHidden="1" w:uiPriority="35" w:unhideWhenUsed="1" w:qFormat="1"/>
+    <w:lsdException w:name="table of figures" w:semiHidden="1" w:unhideWhenUsed="1"/>
+    <w:lsdException w:name="envelope address" w:semiHidden="1" w:unhideWhenUsed="1"/>
+    <w:lsdException w:name="envelope return" w:semiHidden="1" w:unhideWhenUsed="1"/>
+    <w:lsdException w:name="footnote reference" w:semiHidden="1" w:unhideWhenUsed="1"/>
+    <w:lsdException w:name="annotation reference" w:semiHidden="1" w:unhideWhenUsed="1"/>
+    <w:lsdException w:name="line number" w:semiHidden="1" w:unhideWhenUsed="1"/>
+    <w:lsdException w:name="page number" w:semiHidden="1" w:unhideWhenUsed="1"/>
+    <w:lsdException w:name="endnote reference" w:semiHidden="1" w:unhideWhenUsed="1"/>
+    <w:lsdException w:name="endnote text" w:semiHidden="1" w:unhideWhenUsed="1"/>
+    <w:lsdException w:name="table of authorities" w:semiHidden="1" w:unhideWhenUsed="1"/>
+    <w:lsdException w:name="macro" w:semiHidden="1" w:unhideWhenUsed="1"/>
+    <w:lsdException w:name="toa heading" w:semiHidden="1" w:unhideWhenUsed="1"/>
+    <w:lsdException w:name="List" w:semiHidden="1" w:unhideWhenUsed="1"/>
+    <w:lsdException w:name="List Bullet" w:semiHidden="1" w:unhideWhenUsed="1"/>
+    <w:lsdException w:name="List Number" w:semiHidden="1" w:unhideWhenUsed="1"/>
+    <w:lsdException w:name="List 2" w:semiHidden="1" w:unhideWhenUsed="1"/>
+    <w:lsdException w:name="List 3" w:semiHidden="1" w:unhideWhenUsed="1"/>
+    <w:lsdException w:name="List 4" w:semiHidden="1" w:unhideWhenUsed="1"/>
+    <w:lsdException w:name="List 5" w:semiHidden="1" w:unhideWhenUsed="1"/>
+    <w:lsdException w:name="List Bullet 2" w:semiHidden="1" w:unhideWhenUsed="1"/>
+    <w:lsdException w:name="List Bullet 3" w:semiHidden="1" w:unhideWhenUsed="1"/>
+    <w:lsdException w:name="List Bullet 4" w:semiHidden="1" w:unhideWhenUsed="1"/>
+    <w:lsdException w:name="List Bullet 5" w:semiHidden="1" w:unhideWhenUsed="1"/>
+    <w:lsdException w:name="List Number 2" w:semiHidden="1" w:unhideWhenUsed="1"/>
+    <w:lsdException w:name="List Number 3" w:semiHidden="1" w:unhideWhenUsed="1"/>
+    <w:lsdException w:name="List Number 4" w:semiHidden="1" w:unhideWhenUsed="1"/>
+    <w:lsdException w:name="List Number 5" w:semiHidden="1" w:unhideWhenUsed="1"/>
+    <w:lsdException w:name="Title" w:uiPriority="10" w:qFormat="1"/>
+    <w:lsdException w:name="Closing" w:semiHidden="1" w:unhideWhenUsed="1"/>
+    <w:lsdException w:name="Signature" w:semiHidden="1" w:unhideWhenUsed="1"/>
+    <w:lsdException w:name="Default Paragraph Font" w:semiHidden="1" w:uiPriority="1" w:unhideWhenUsed="1"/>
+    <w:lsdException w:name="Body Text" w:semiHidden="1" w:unhideWhenUsed="1"/>
+    <w:lsdException w:name="Body Text Indent" w:semiHidden="1" w:unhideWhenUsed="1"/>
+    <w:lsdException w:name="List Continue" w:semiHidden="1" w:unhideWhenUsed="1"/>
+    <w:lsdException w:name="List Continue 2" w:semiHidden="1" w:unhideWhenUsed="1"/>
+    <w:lsdException w:name="List Continue 3" w:semiHidden="1" w:unhideWhenUsed="1"/>
+    <w:lsdException w:name="List Continue 4" w:semiHidden="1" w:unhideWhenUsed="1"/>
+    <w:lsdException w:name="List Continue 5" w:semiHidden="1" w:unhideWhenUsed="1"/>
+    <w:lsdException w:name="Message Header" w:semiHidden="1" w:unhideWhenUsed="1"/>
+    <w:lsdException w:name="Subtitle" w:uiPriority="11" w:qFormat="1"/>
+    <w:lsdException w:name="Salutation" w:semiHidden="1" w:unhideWhenUsed="1"/>
+    <w:lsdException w:name="Date" w:semiHidden="1" w:unhideWhenUsed="1"/>
+    <w:lsdException w:name="Body Text First Indent" w:semiHidden="1" w:unhideWhenUsed="1"/>
+    <w:lsdException w:name="Body Text First Indent 2" w:semiHidden="1" w:unhideWhenUsed="1"/>
+    <w:lsdException w:name="Note Heading" w:semiHidden="1" w:unhideWhenUsed="1"/>
+    <w:lsdException w:name="Body Text 2" w:semiHidden="1" w:unhideWhenUsed="1"/>
+    <w:lsdException w:name="Body Text 3" w:semiHidden="1" w:unhideWhenUsed="1"/>
+    <w:lsdException w:name="Body Text Indent 2" w:semiHidden="1" w:unhideWhenUsed="1"/>
+    <w:lsdException w:name="Body Text Indent 3" w:semiHidden="1" w:unhideWhenUsed="1"/>
+    <w:lsdException w:name="Block Text" w:semiHidden="1" w:unhideWhenUsed="1"/>
+    <w:lsdException w:name="Hyperlink" w:semiHidden="1" w:unhideWhenUsed="1"/>
+    <w:lsdException w:name="FollowedHyperlink" w:semiHidden="1" w:unhideWhenUsed="1"/>
+    <w:lsdException w:name="Strong" w:uiPriority="22" w:qFormat="1"/>
+    <w:lsdException w:name="Emphasis" w:uiPriority="20" w:qFormat="1"/>
+    <w:lsdException w:name="Document Map" w:semiHidden="1" w:unhideWhenUsed="1"/>
+    <w:lsdException w:name="Plain Text" w:semiHidden="1" w:unhideWhenUsed="1"/>
+    <w:lsdException w:name="E-mail Signature" w:semiHidden="1" w:unhideWhenUsed="1"/>
+    <w:lsdException w:name="HTML Top of Form" w:semiHidden="1" w:unhideWhenUsed="1"/>
+    <w:lsdException w:name="HTML Bottom of Form" w:semiHidden="1" w:unhideWhenUsed="1"/>
+    <w:lsdException w:name="Normal (Web)" w:semiHidden="1" w:unhideWhenUsed="1"/>
+    <w:lsdException w:name="HTML Acronym" w:semiHidden="1" w:unhideWhenUsed="1"/>
+    <w:lsdException w:name="HTML Address" w:semiHidden="1" w:unhideWhenUsed="1"/>
+    <w:lsdException w:name="HTML Cite" w:semiHidden="1" w:unhideWhenUsed="1"/>
+    <w:lsdException w:name="HTML Code" w:semiHidden="1" w:unhideWhenUsed="1"/>
+    <w:lsdException w:name="HTML Definition" w:semiHidden="1" w:unhideWhenUsed="1"/>
+    <w:lsdException w:name="HTML Keyboard" w:semiHidden="1" w:unhideWhenUsed="1"/>
+    <w:lsdException w:name="HTML Preformatted" w:semiHidden="1" w:unhideWhenUsed="1"/>
+    <w:lsdException w:name="HTML Sample" w:semiHidden="1" w:unhideWhenUsed="1"/>
+    <w:lsdException w:name="HTML Typewriter" w:semiHidden="1" w:unhideWhenUsed="1"/>
+    <w:lsdException w:name="HTML Variable" w:semiHidden="1" w:unhideWhenUsed="1"/>
+    <w:lsdException w:name="Normal Table" w:semiHidden="1" w:unhideWhenUsed="1"/>
+    <w:lsdException w:name="annotation subject" w:semiHidden="1" w:unhideWhenUsed="1"/>
+    <w:lsdException w:name="No List" w:semiHidden="1" w:unhideWhenUsed="1"/>
+    <w:lsdException w:name="Outline List 1" w:semiHidden="1" w:unhideWhenUsed="1"/>
+    <w:lsdException w:name="Outline List 2" w:semiHidden="1" w:unhideWhenUsed="1"/>
+    <w:lsdException w:name="Outline List 3" w:semiHidden="1" w:unhideWhenUsed="1"/>
+    <w:lsdException w:name="Table Simple 1" w:semiHidden="1" w:unhideWhenUsed="1"/>
+    <w:lsdException w:name="Table Simple 2" w:semiHidden="1" w:unhideWhenUsed="1"/>
+    <w:lsdException w:name="Table Simple 3" w:semiHidden="1" w:unhideWhenUsed="1"/>
+    <w:lsdException w:name="Table Classic 1" w:semiHidden="1" w:unhideWhenUsed="1"/>
+    <w:lsdException w:name="Table Classic 2" w:semiHidden="1" w:unhideWhenUsed="1"/>
+    <w:lsdException w:name="Table Classic 3" w:semiHidden="1" w:unhideWhenUsed="1"/>
+    <w:lsdException w:name="Table Classic 4" w:semiHidden="1" w:unhideWhenUsed="1"/>
+    <w:lsdException w:name="Table Colorful 1" w:semiHidden="1" w:unhideWhenUsed="1"/>
+    <w:lsdException w:name="Table Colorful 2" w:semiHidden="1" w:unhideWhenUsed="1"/>
+    <w:lsdException w:name="Table Colorful 3" w:semiHidden="1" w:unhideWhenUsed="1"/>
+    <w:lsdException w:name="Table Columns 1" w:semiHidden="1" w:unhideWhenUsed="1"/>
+    <w:lsdException w:name="Table Columns 2" w:semiHidden="1" w:unhideWhenUsed="1"/>
+    <w:lsdException w:name="Table Columns 3" w:semiHidden="1" w:unhideWhenUsed="1"/>
+    <w:lsdException w:name="Table Columns 4" w:semiHidden="1" w:unhideWhenUsed="1"/>
+    <w:lsdException w:name="Table Columns 5" w:semiHidden="1" w:unhideWhenUsed="1"/>
+    <w:lsdException w:name="Table Grid 1" w:semiHidden="1" w:unhideWhenUsed="1"/>
+    <w:lsdException w:name="Table Grid 2" w:semiHidden="1" w:unhideWhenUsed="1"/>
+    <w:lsdException w:name="Table Grid 3" w:semiHidden="1" w:unhideWhenUsed="1"/>
+    <w:lsdException w:name="Table Grid 4" w:semiHidden="1" w:unhideWhenUsed="1"/>
+    <w:lsdException w:name="Table Grid 5" w:semiHidden="1" w:unhideWhenUsed="1"/>
+    <w:lsdException w:name="Table Grid 6" w:semiHidden="1" w:unhideWhenUsed="1"/>
+    <w:lsdException w:name="Table Grid 7" w:semiHidden="1" w:unhideWhenUsed="1"/>
+    <w:lsdException w:name="Table Grid 8" w:semiHidden="1" w:unhideWhenUsed="1"/>
+    <w:lsdException w:name="Table List 1" w:semiHidden="1" w:unhideWhenUsed="1"/>
+    <w:lsdException w:name="Table List 2" w:semiHidden="1" w:unhideWhenUsed="1"/>
+    <w:lsdException w:name="Table List 3" w:semiHidden="1" w:unhideWhenUsed="1"/>
+    <w:lsdException w:name="Table List 4" w:semiHidden="1" w:unhideWhenUsed="1"/>
+    <w:lsdException w:name="Table List 5" w:semiHidden="1" w:unhideWhenUsed="1"/>
+    <w:lsdException w:name="Table List 6" w:semiHidden="1" w:unhideWhenUsed="1"/>
+    <w:lsdException w:name="Table List 7" w:semiHidden="1" w:unhideWhenUsed="1"/>
+    <w:lsdException w:name="Table List 8" w:semiHidden="1" w:unhideWhenUsed="1"/>
+    <w:lsdException w:name="Table 3D effects 1" w:semiHidden="1" w:unhideWhenUsed="1"/>
+    <w:lsdException w:name="Table 3D effects 2" w:semiHidden="1" w:unhideWhenUsed="1"/>
+    <w:lsdException w:name="Table 3D effects 3" w:semiHidden="1" w:unhideWhenUsed="1"/>
+    <w:lsdException w:name="Table Contemporary" w:semiHidden="1" w:unhideWhenUsed="1"/>
+    <w:lsdException w:name="Table Elegant" w:semiHidden="1" w:unhideWhenUsed="1"/>
+    <w:lsdException w:name="Table Professional" w:semiHidden="1" w:unhideWhenUsed="1"/>
+    <w:lsdException w:name="Table Subtle 1" w:semiHidden="1" w:unhideWhenUsed="1"/>
+    <w:lsdException w:name="Table Subtle 2" w:semiHidden="1" w:unhideWhenUsed="1"/>
+    <w:lsdException w:name="Table Web 1" w:semiHidden="1" w:unhideWhenUsed="1"/>
+    <w:lsdException w:name="Table Web 2" w:semiHidden="1" w:unhideWhenUsed="1"/>
+    <w:lsdException w:name="Table Web 3" w:semiHidden="1" w:unhideWhenUsed="1"/>
+    <w:lsdException w:name="Balloon Text" w:semiHidden="1" w:unhideWhenUsed="1"/>
+    <w:lsdException w:name="Table Grid" w:semiHidden="1" w:uiPriority="59" w:unhideWhenUsed="1"/>
+    <w:lsdException w:name="Table Theme" w:semiHidden="1" w:unhideWhenUsed="1"/>
+    <w:lsdException w:name="Placeholder Text" w:semiHidden="1"/>
+    <w:lsdException w:name="No Spacing" w:uiPriority="1" w:qFormat="1"/>
+    <w:lsdException w:name="Light Shading" w:uiPriority="60"/>
+    <w:lsdException w:name="Light List" w:uiPriority="61"/>
+    <w:lsdException w:name="Light Grid" w:uiPriority="62"/>
+    <w:lsdException w:name="Medium Shading 1" w:uiPriority="63"/>
+    <w:lsdException w:name="Medium Shading 2" w:uiPriority="64"/>
+    <w:lsdException w:name="Medium List 1" w:uiPriority="65"/>
+    <w:lsdException w:name="Medium List 2" w:uiPriority="66"/>
+    <w:lsdException w:name="Medium Grid 1" w:uiPriority="67"/>
+    <w:lsdException w:name="Medium Grid 2" w:uiPriority="68"/>
+    <w:lsdException w:name="Medium Grid 3" w:uiPriority="69"/>
+    <w:lsdException w:name="Dark List" w:uiPriority="70"/>
+    <w:lsdException w:name="Colorful Shading" w:uiPriority="71"/>
+    <w:lsdException w:name="Colorful List" w:uiPriority="72"/>
+    <w:lsdException w:name="Colorful Grid" w:uiPriority="73"/>
+    <w:lsdException w:name="Light Shading Accent 1" w:uiPriority="60"/>
+    <w:lsdException w:name="Light List Accent 1" w:uiPriority="61"/>
+    <w:lsdException w:name="Light Grid Accent 1" w:uiPriority="62"/>
+    <w:lsdException w:name="Medium Shading 1 Accent 1" w:uiPriority="63"/>
+    <w:lsdException w:name="Medium Shading 2 Accent 1" w:uiPriority="64"/>
+    <w:lsdException w:name="Medium List 1 Accent 1" w:uiPriority="65"/>
+    <w:lsdException w:name="Revision" w:semiHidden="1"/>
+    <w:lsdException w:name="List Paragraph" w:uiPriority="34" w:qFormat="1"/>
+    <w:lsdException w:name="Quote" w:uiPriority="29" w:qFormat="1"/>
+    <w:lsdException w:name="Intense Quote" w:uiPriority="30" w:qFormat="1"/>
+    <w:lsdException w:name="Medium List 2 Accent 1" w:uiPriority="66"/>
+    <w:lsdException w:name="Medium Grid 1 Accent 1" w:uiPriority="67"/>
+    <w:lsdException w:name="Medium Grid 2 Accent 1" w:uiPriority="68"/>
+    <w:lsdException w:name="Medium Grid 3 Accent 1" w:uiPriority="69"/>
+    <w:lsdException w:name="Dark List Accent 1" w:uiPriority="70"/>
+    <w:lsdException w:name="Colorful Shading Accent 1" w:uiPriority="71"/>
+    <w:lsdException w:name="Colorful List Accent 1" w:uiPriority="72"/>
+    <w:lsdException w:name="Colorful Grid Accent 1" w:uiPriority="73"/>
+    <w:lsdException w:name="Light Shading Accent 2" w:uiPriority="60"/>
+    <w:lsdException w:name="Light List Accent 2" w:uiPriority="61"/>
+    <w:lsdException w:name="Light Grid Accent 2" w:uiPriority="62"/>
+    <w:lsdException w:name="Medium Shading 1 Accent 2" w:uiPriority="63"/>
+    <w:lsdException w:name="Medium Shading 2 Accent 2" w:uiPriority="64"/>
+    <w:lsdException w:name="Medium List 1 Accent 2" w:uiPriority="65"/>
+    <w:lsdException w:name="Medium List 2 Accent 2" w:uiPriority="66"/>
+    <w:lsdException w:name="Medium Grid 1 Accent 2" w:uiPriority="67"/>
+    <w:lsdException w:name="Medium Grid 2 Accent 2" w:uiPriority="68"/>
+    <w:lsdException w:name="Medium Grid 3 Accent 2" w:uiPriority="69"/>
+    <w:lsdException w:name="Dark List Accent 2" w:uiPriority="70"/>
+    <w:lsdException w:name="Colorful Shading Accent 2" w:uiPriority="71"/>
+    <w:lsdException w:name="Colorful List Accent 2" w:uiPriority="72"/>
+    <w:lsdException w:name="Colorful Grid Accent 2" w:uiPriority="73"/>
+    <w:lsdException w:name="Light Shading Accent 3" w:uiPriority="60"/>
+    <w:lsdException w:name="Light List Accent 3" w:uiPriority="61"/>
+    <w:lsdException w:name="Light Grid Accent 3" w:uiPriority="62"/>
+    <w:lsdException w:name="Medium Shading 1 Accent 3" w:uiPriority="63"/>
+    <w:lsdException w:name="Medium Shading 2 Accent 3" w:uiPriority="64"/>
+    <w:lsdException w:name="Medium List 1 Accent 3" w:uiPriority="65"/>
+    <w:lsdException w:name="Medium List 2 Accent 3" w:uiPriority="66"/>
+    <w:lsdException w:name="Medium Grid 1 Accent 3" w:uiPriority="67"/>
+    <w:lsdException w:name="Medium Grid 2 Accent 3" w:uiPriority="68"/>
+    <w:lsdException w:name="Medium Grid 3 Accent 3" w:uiPriority="69"/>
+    <w:lsdException w:name="Dark List Accent 3" w:uiPriority="70"/>
+    <w:lsdException w:name="Colorful Shading Accent 3" w:uiPriority="71"/>
+    <w:lsdException w:name="Colorful List Accent 3" w:uiPriority="72"/>
+    <w:lsdException w:name="Colorful Grid Accent 3" w:uiPriority="73"/>
+    <w:lsdException w:name="Light Shading Accent 4" w:uiPriority="60"/>
+    <w:lsdException w:name="Light List Accent 4" w:uiPriority="61"/>
+    <w:lsdException w:name="Light Grid Accent 4" w:uiPriority="62"/>
+    <w:lsdException w:name="Medium Shading 1 Accent 4" w:uiPriority="63"/>
+    <w:lsdException w:name="Medium Shading 2 Accent 4" w:uiPriority="64"/>
+    <w:lsdException w:name="Medium List 1 Accent 4" w:uiPriority="65"/>
+    <w:lsdException w:name="Medium List 2 Accent 4" w:uiPriority="66"/>
+    <w:lsdException w:name="Medium Grid 1 Accent 4" w:uiPriority="67"/>
+    <w:lsdException w:name="Medium Grid 2 Accent 4" w:uiPriority="68"/>
+    <w:lsdException w:name="Medium Grid 3 Accent 4" w:uiPriority="69"/>
+    <w:lsdException w:name="Dark List Accent 4" w:uiPriority="70"/>
+    <w:lsdException w:name="Colorful Shading Accent 4" w:uiPriority="71"/>
+    <w:lsdException w:name="Colorful List Accent 4" w:uiPriority="72"/>
+    <w:lsdException w:name="Colorful Grid Accent 4" w:uiPriority="73"/>
+    <w:lsdException w:name="Light Shading Accent 5" w:uiPriority="60"/>
+    <w:lsdException w:name="Light List Accent 5" w:uiPriority="61"/>
+    <w:lsdException w:name="Light Grid Accent 5" w:uiPriority="62"/>
+    <w:lsdException w:name="Medium Shading 1 Accent 5" w:uiPriority="63"/>
+    <w:lsdException w:name="Medium Shading 2 Accent 5" w:uiPriority="64"/>
+    <w:lsdException w:name="Medium List 1 Accent 5" w:uiPriority="65"/>
+    <w:lsdException w:name="Medium List 2 Accent 5" w:uiPriority="66"/>
+    <w:lsdException w:name="Medium Grid 1 Accent 5" w:uiPriority="67"/>
+    <w:lsdException w:name="Medium Grid 2 Accent 5" w:uiPriority="68"/>
+    <w:lsdException w:name="Medium Grid 3 Accent 5" w:uiPriority="69"/>
+    <w:lsdException w:name="Dark List Accent 5" w:uiPriority="70"/>
+    <w:lsdException w:name="Colorful Shading Accent 5" w:uiPriority="71"/>
+    <w:lsdException w:name="Colorful List Accent 5" w:uiPriority="72"/>
+    <w:lsdException w:name="Colorful Grid Accent 5" w:uiPriority="73"/>
+    <w:lsdException w:name="Light Shading Accent 6" w:uiPriority="60"/>
+    <w:lsdException w:name="Light List Accent 6" w:uiPriority="61"/>
+    <w:lsdException w:name="Light Grid Accent 6" w:uiPriority="62"/>
+    <w:lsdException w:name="Medium Shading 1 Accent 6" w:uiPriority="63"/>
+    <w:lsdException w:name="Medium Shading 2 Accent 6" w:uiPriority="64"/>
+    <w:lsdException w:name="Medium List 1 Accent 6" w:uiPriority="65"/>
+    <w:lsdException w:name="Medium List 2 Accent 6" w:uiPriority="66"/>
+    <w:lsdException w:name="Medium Grid 1 Accent 6" w:uiPriority="67"/>
+    <w:lsdException w:name="Medium Grid 2 Accent 6" w:uiPriority="68"/>
+    <w:lsdException w:name="Medium Grid 3 Accent 6" w:uiPriority="69"/>
+    <w:lsdException w:name="Dark List Accent 6" w:uiPriority="70"/>
+    <w:lsdException w:name="Colorful Shading Accent 6" w:uiPriority="71"/>
+    <w:lsdException w:name="Colorful List Accent 6" w:uiPriority="72"/>
+    <w:lsdException w:name="Colorful Grid Accent 6" w:uiPriority="73"/>
+    <w:lsdException w:name="Subtle Emphasis" w:uiPriority="19" w:qFormat="1"/>
+    <w:lsdException w:name="Intense Emphasis" w:uiPriority="21" w:qFormat="1"/>
+    <w:lsdException w:name="Subtle Reference" w:uiPriority="31" w:qFormat="1"/>
+    <w:lsdException w:name="Intense Reference" w:uiPriority="32" w:qFormat="1"/>
+    <w:lsdException w:name="Book Title" w:uiPriority="33" w:qFormat="1"/>
+    <w:lsdException w:name="Bibliography" w:semiHidden="1" w:uiPriority="37" w:unhideWhenUsed="1"/>
+    <w:lsdException w:name="TOC Heading" w:semiHidden="1" w:uiPriority="39" w:unhideWhenUsed="1" w:qFormat="1"/>
+    <w:lsdException w:name="Plain Table 1" w:uiPriority="41"/>
+    <w:lsdException w:name="Plain Table 2" w:uiPriority="42"/>
+    <w:lsdException w:name="Plain Table 3" w:uiPriority="43"/>
+    <w:lsdException w:name="Plain Table 4" w:uiPriority="44"/>
+    <w:lsdException w:name="Plain Table 5" w:uiPriority="45"/>
+    <w:lsdException w:name="Grid Table Light" w:uiPriority="40"/>
+    <w:lsdException w:name="Grid Table 1 Light" w:uiPriority="46"/>
+    <w:lsdException w:name="Grid Table 2" w:uiPriority="47"/>
+    <w:lsdException w:name="Grid Table 3" w:uiPriority="48"/>
+    <w:lsdException w:name="Grid Table 4" w:uiPriority="49"/>
+    <w:lsdException w:name="Grid Table 5 Dark" w:uiPriority="50"/>
+    <w:lsdException w:name="Grid Table 6 Colorful" w:uiPriority="51"/>
+    <w:lsdException w:name="Grid Table 7 Colorful" w:uiPriority="52"/>
+    <w:lsdException w:name="Grid Table 1 Light Accent 1" w:uiPriority="46"/>
+    <w:lsdException w:name="Grid Table 2 Accent 1" w:uiPriority="47"/>
+    <w:lsdException w:name="Grid Table 3 Accent 1" w:uiPriority="48"/>
+    <w:lsdException w:name="Grid Table 4 Accent 1" w:uiPriority="49"/>
+    <w:lsdException w:name="Grid Table 5 Dark Accent 1" w:uiPriority="50"/>
+    <w:lsdException w:name="Grid Table 6 Colorful Accent 1" w:uiPriority="51"/>
+    <w:lsdException w:name="Grid Table 7 Colorful Accent 1" w:uiPriority="52"/>
+    <w:lsdException w:name="Grid Table 1 Light Accent 2" w:uiPriority="46"/>
+    <w:lsdException w:name="Grid Table 2 Accent 2" w:uiPriority="47"/>
+    <w:lsdException w:name="Grid Table 3 Accent 2" w:uiPriority="48"/>
+    <w:lsdException w:name="Grid Table 4 Accent 2" w:uiPriority="49"/>
+    <w:lsdException w:name="Grid Table 5 Dark Accent 2" w:uiPriority="50"/>
+    <w:lsdException w:name="Grid Table 6 Colorful Accent 2" w:uiPriority="51"/>
+    <w:lsdException w:name="Grid Table 7 Colorful Accent 2" w:uiPriority="52"/>
+    <w:lsdException w:name="Grid Table 1 Light Accent 3" w:uiPriority="46"/>
+    <w:lsdException w:name="Grid Table 2 Accent 3" w:uiPriority="47"/>
+    <w:lsdException w:name="Grid Table 3 Accent 3" w:uiPriority="48"/>
+    <w:lsdException w:name="Grid Table 4 Accent 3" w:uiPriority="49"/>
+    <w:lsdException w:name="Grid Table 5 Dark Accent 3" w:uiPriority="50"/>
+    <w:lsdException w:name="Grid Table 6 Colorful Accent 3" w:uiPriority="51"/>
+    <w:lsdException w:name="Grid Table 7 Colorful Accent 3" w:uiPriority="52"/>
+    <w:lsdException w:name="Grid Table 1 Light Accent 4" w:uiPriority="46"/>
+    <w:lsdException w:name="Grid Table 2 Accent 4" w:uiPriority="47"/>
+    <w:lsdException w:name="Grid Table 3 Accent 4" w:uiPriority="48"/>
+    <w:lsdException w:name="Grid Table 4 Accent 4" w:uiPriority="49"/>
+    <w:lsdException w:name="Grid Table 5 Dark Accent 4" w:uiPriority="50"/>
+    <w:lsdException w:name="Grid Table 6 Colorful Accent 4" w:uiPriority="51"/>
+    <w:lsdException w:name="Grid Table 7 Colorful Accent 4" w:uiPriority="52"/>
+    <w:lsdException w:name="Grid Table 1 Light Accent 5" w:uiPriority="46"/>
+    <w:lsdException w:name="Grid Table 2 Accent 5" w:uiPriority="47"/>
+    <w:lsdException w:name="Grid Table 3 Accent 5" w:uiPriority="48"/>
+    <w:lsdException w:name="Grid Table 4 Accent 5" w:uiPriority="49"/>
+    <w:lsdException w:name="Grid Table 5 Dark Accent 5" w:uiPriority="50"/>
+    <w:lsdException w:name="Grid Table 6 Colorful Accent 5" w:uiPriority="51"/>
+    <w:lsdException w:name="Grid Table 7 Colorful Accent 5" w:uiPriority="52"/>
+    <w:lsdException w:name="Grid Table 1 Light Accent 6" w:uiPriority="46"/>
+    <w:lsdException w:name="Grid Table 2 Accent 6" w:uiPriority="47"/>
+    <w:lsdException w:name="Grid Table 3 Accent 6" w:uiPriority="48"/>
+    <w:lsdException w:name="Grid Table 4 Accent 6" w:uiPriority="49"/>
+    <w:lsdException w:name="Grid Table 5 Dark Accent 6" w:uiPriority="50"/>
+    <w:lsdException w:name="Grid Table 6 Colorful Accent 6" w:uiPriority="51"/>
+    <w:lsdException w:name="Grid Table 7 Colorful Accent 6" w:uiPriority="52"/>
+    <w:lsdException w:name="List Table 1 Light" w:uiPriority="46"/>
+    <w:lsdException w:name="List Table 2" w:uiPriority="47"/>
+    <w:lsdException w:name="List Table 3" w:uiPriority="48"/>
+    <w:lsdException w:name="List Table 4" w:uiPriority="49"/>
+    <w:lsdException w:name="List Table 5 Dark" w:uiPriority="50"/>
+    <w:lsdException w:name="List Table 6 Colorful" w:uiPriority="51"/>
+    <w:lsdException w:name="List Table 7 Colorful" w:uiPriority="52"/>
+    <w:lsdException w:name="List Table 1 Light Accent 1" w:uiPriority="46"/>
+    <w:lsdException w:name="List Table 2 Accent 1" w:uiPriority="47"/>
+    <w:lsdException w:name="List Table 3 Accent 1" w:uiPriority="48"/>
+    <w:lsdException w:name="List Table 4 Accent 1" w:uiPriority="49"/>
+    <w:lsdException w:name="List Table 5 Dark Accent 1" w:uiPriority="50"/>
+    <w:lsdException w:name="List Table 6 Colorful Accent 1" w:uiPriority="51"/>
+    <w:lsdException w:name="List Table 7 Colorful Accent 1" w:uiPriority="52"/>
+    <w:lsdException w:name="List Table 1 Light Accent 2" w:uiPriority="46"/>
+    <w:lsdException w:name="List Table 2 Accent 2" w:uiPriority="47"/>
+    <w:lsdException w:name="List Table 3 Accent 2" w:uiPriority="48"/>
+    <w:lsdException w:name="List Table 4 Accent 2" w:uiPriority="49"/>
+    <w:lsdException w:name="List Table 5 Dark Accent 2" w:uiPriority="50"/>
+    <w:lsdException w:name="List Table 6 Colorful Accent 2" w:uiPriority="51"/>
+    <w:lsdException w:name="List Table 7 Colorful Accent 2" w:uiPriority="52"/>
+    <w:lsdException w:name="List Table 1 Light Accent 3" w:uiPriority="46"/>
+    <w:lsdException w:name="List Table 2 Accent 3" w:uiPriority="47"/>
+    <w:lsdException w:name="List Table 3 Accent 3" w:uiPriority="48"/>
+    <w:lsdException w:name="List Table 4 Accent 3" w:uiPriority="49"/>
+    <w:lsdException w:name="List Table 5 Dark Accent 3" w:uiPriority="50"/>
+    <w:lsdException w:name="List Table 6 Colorful Accent 3" w:uiPriority="51"/>
+    <w:lsdException w:name="List Table 7 Colorful Accent 3" w:uiPriority="52"/>
+    <w:lsdException w:name="List Table 1 Light Accent 4" w:uiPriority="46"/>
+    <w:lsdException w:name="List Table 2 Accent 4" w:uiPriority="47"/>
+    <w:lsdException w:name="List Table 3 Accent 4" w:uiPriority="48"/>
+    <w:lsdException w:name="List Table 4 Accent 4" w:uiPriority="49"/>
+    <w:lsdException w:name="List Table 5 Dark Accent 4" w:uiPriority="50"/>
+    <w:lsdException w:name="List Table 6 Colorful Accent 4" w:uiPriority="51"/>
+    <w:lsdException w:name="List Table 7 Colorful Accent 4" w:uiPriority="52"/>
+    <w:lsdException w:name="List Table 1 Light Accent 5" w:uiPriority="46"/>
+    <w:lsdException w:name="List Table 2 Accent 5" w:uiPriority="47"/>
+    <w:lsdException w:name="List Table 3 Accent 5" w:uiPriority="48"/>
+    <w:lsdException w:name="List Table 4 Accent 5" w:uiPriority="49"/>
+    <w:lsdException w:name="List Table 5 Dark Accent 5" w:uiPriority="50"/>
+    <w:lsdException w:name="List Table 6 Colorful Accent 5" w:uiPriority="51"/>
+    <w:lsdException w:name="List Table 7 Colorful Accent 5" w:uiPriority="52"/>
+    <w:lsdException w:name="List Table 1 Light Accent 6" w:uiPriority="46"/>
+    <w:lsdException w:name="List Table 2 Accent 6" w:uiPriority="47"/>
+    <w:lsdException w:name="List Table 3 Accent 6" w:uiPriority="48"/>
+    <w:lsdException w:name="List Table 4 Accent 6" w:uiPriority="49"/>
+    <w:lsdException w:name="List Table 5 Dark Accent 6" w:uiPriority="50"/>
+    <w:lsdException w:name="List Table 6 Colorful Accent 6" w:uiPriority="51"/>
+    <w:lsdException w:name="List Table 7 Colorful Accent 6" w:uiPriority="52"/>
+    <w:lsdException w:name="Mention" w:semiHidden="1" w:unhideWhenUsed="1"/>
+    <w:lsdException w:name="Smart Hyperlink" w:semiHidden="1" w:unhideWhenUsed="1"/>
+    <w:lsdException w:name="Hashtag" w:semiHidden="1" w:unhideWhenUsed="1"/>
+    <w:lsdException w:name="Unresolved Mention" w:semiHidden="1" w:unhideWhenUsed="1"/>
+    <w:lsdException w:name="Smart Link" w:semiHidden="1" w:unhideWhenUsed="1"/>
   </w:latentStyles>
-  <w:style w:type="paragraph" w:default="1" w:styleId="a">
+  <w:style w:type="paragraph" w:default="1" w:styleId="Normal">
     <w:name w:val="Normal"/>
   </w:style>
-  <w:style w:type="paragraph" w:styleId="1">
+  <w:style w:type="paragraph" w:styleId="Heading1">
     <w:name w:val="heading 1"/>
-    <w:basedOn w:val="a"/>
-    <w:next w:val="a"/>
+    <w:basedOn w:val="Normal"/>
+    <w:next w:val="Normal"/>
     <w:pPr>
       <w:keepNext/>
       <w:keepLines/>
@@ -2927,10 +3301,10 @@
       <w:szCs w:val="40"/>
     </w:rPr>
   </w:style>
-  <w:style w:type="paragraph" w:styleId="2">
+  <w:style w:type="paragraph" w:styleId="Heading2">
     <w:name w:val="heading 2"/>
-    <w:basedOn w:val="a"/>
-    <w:next w:val="a"/>
+    <w:basedOn w:val="Normal"/>
+    <w:next w:val="Normal"/>
     <w:pPr>
       <w:keepNext/>
       <w:keepLines/>
@@ -2942,10 +3316,10 @@
       <w:szCs w:val="32"/>
     </w:rPr>
   </w:style>
-  <w:style w:type="paragraph" w:styleId="3">
+  <w:style w:type="paragraph" w:styleId="Heading3">
     <w:name w:val="heading 3"/>
-    <w:basedOn w:val="a"/>
-    <w:next w:val="a"/>
+    <w:basedOn w:val="Normal"/>
+    <w:next w:val="Normal"/>
     <w:pPr>
       <w:keepNext/>
       <w:keepLines/>
@@ -2958,10 +3332,10 @@
       <w:szCs w:val="28"/>
     </w:rPr>
   </w:style>
-  <w:style w:type="paragraph" w:styleId="4">
+  <w:style w:type="paragraph" w:styleId="Heading4">
     <w:name w:val="heading 4"/>
-    <w:basedOn w:val="a"/>
-    <w:next w:val="a"/>
+    <w:basedOn w:val="Normal"/>
+    <w:next w:val="Normal"/>
     <w:pPr>
       <w:keepNext/>
       <w:keepLines/>
@@ -2974,10 +3348,10 @@
       <w:szCs w:val="24"/>
     </w:rPr>
   </w:style>
-  <w:style w:type="paragraph" w:styleId="5">
+  <w:style w:type="paragraph" w:styleId="Heading5">
     <w:name w:val="heading 5"/>
-    <w:basedOn w:val="a"/>
-    <w:next w:val="a"/>
+    <w:basedOn w:val="Normal"/>
+    <w:next w:val="Normal"/>
     <w:pPr>
       <w:keepNext/>
       <w:keepLines/>
@@ -2988,10 +3362,10 @@
       <w:color w:val="666666"/>
     </w:rPr>
   </w:style>
-  <w:style w:type="paragraph" w:styleId="6">
+  <w:style w:type="paragraph" w:styleId="Heading6">
     <w:name w:val="heading 6"/>
-    <w:basedOn w:val="a"/>
-    <w:next w:val="a"/>
+    <w:basedOn w:val="Normal"/>
+    <w:next w:val="Normal"/>
     <w:pPr>
       <w:keepNext/>
       <w:keepLines/>
@@ -3003,13 +3377,13 @@
       <w:color w:val="666666"/>
     </w:rPr>
   </w:style>
-  <w:style w:type="character" w:default="1" w:styleId="a0">
+  <w:style w:type="character" w:default="1" w:styleId="DefaultParagraphFont">
     <w:name w:val="Default Paragraph Font"/>
     <w:uiPriority w:val="1"/>
     <w:semiHidden/>
     <w:unhideWhenUsed/>
   </w:style>
-  <w:style w:type="table" w:default="1" w:styleId="a1">
+  <w:style w:type="table" w:default="1" w:styleId="TableNormal">
     <w:name w:val="Normal Table"/>
     <w:uiPriority w:val="99"/>
     <w:semiHidden/>
@@ -3024,14 +3398,14 @@
       </w:tblCellMar>
     </w:tblPr>
   </w:style>
-  <w:style w:type="numbering" w:default="1" w:styleId="a2">
+  <w:style w:type="numbering" w:default="1" w:styleId="NoList">
     <w:name w:val="No List"/>
     <w:uiPriority w:val="99"/>
     <w:semiHidden/>
     <w:unhideWhenUsed/>
   </w:style>
-  <w:style w:type="table" w:customStyle="1" w:styleId="TableNormal">
-    <w:name w:val="Table Normal"/>
+  <w:style w:type="table" w:customStyle="1" w:styleId="TableNormal1">
+    <w:name w:val="Table Normal1"/>
     <w:tblPr>
       <w:tblCellMar>
         <w:top w:w="0" w:type="dxa"/>
@@ -3041,10 +3415,10 @@
       </w:tblCellMar>
     </w:tblPr>
   </w:style>
-  <w:style w:type="paragraph" w:styleId="a3">
+  <w:style w:type="paragraph" w:styleId="Title">
     <w:name w:val="Title"/>
-    <w:basedOn w:val="a"/>
-    <w:next w:val="a"/>
+    <w:basedOn w:val="Normal"/>
+    <w:next w:val="Normal"/>
     <w:pPr>
       <w:keepNext/>
       <w:keepLines/>
@@ -3057,10 +3431,10 @@
       <w:szCs w:val="52"/>
     </w:rPr>
   </w:style>
-  <w:style w:type="paragraph" w:styleId="a4">
+  <w:style w:type="paragraph" w:styleId="Subtitle">
     <w:name w:val="Subtitle"/>
-    <w:basedOn w:val="a"/>
-    <w:next w:val="a"/>
+    <w:basedOn w:val="Normal"/>
+    <w:next w:val="Normal"/>
     <w:pPr>
       <w:keepNext/>
       <w:keepLines/>
@@ -3072,8 +3446,8 @@
       <w:szCs w:val="30"/>
     </w:rPr>
   </w:style>
-  <w:style w:type="table" w:customStyle="1" w:styleId="a5">
-    <w:basedOn w:val="TableNormal"/>
+  <w:style w:type="table" w:customStyle="1" w:styleId="a">
+    <w:basedOn w:val="TableNormal1"/>
     <w:tblPr>
       <w:tblStyleRowBandSize w:val="1"/>
       <w:tblStyleColBandSize w:val="1"/>
@@ -3085,10 +3459,10 @@
       </w:tblCellMar>
     </w:tblPr>
   </w:style>
-  <w:style w:type="paragraph" w:styleId="a6">
+  <w:style w:type="paragraph" w:styleId="BalloonText">
     <w:name w:val="Balloon Text"/>
-    <w:basedOn w:val="a"/>
-    <w:link w:val="a7"/>
+    <w:basedOn w:val="Normal"/>
+    <w:link w:val="BalloonTextChar"/>
     <w:uiPriority w:val="99"/>
     <w:semiHidden/>
     <w:unhideWhenUsed/>
@@ -3102,383 +3476,10 @@
       <w:szCs w:val="16"/>
     </w:rPr>
   </w:style>
-  <w:style w:type="character" w:customStyle="1" w:styleId="a7">
-    <w:name w:val="טקסט בלונים תו"/>
-    <w:basedOn w:val="a0"/>
-    <w:link w:val="a6"/>
-    <w:uiPriority w:val="99"/>
-    <w:semiHidden/>
-    <w:rsid w:val="00E271FC"/>
-    <w:rPr>
-      <w:rFonts w:ascii="Tahoma" w:hAnsi="Tahoma" w:cs="Tahoma"/>
-      <w:sz w:val="16"/>
-      <w:szCs w:val="16"/>
-    </w:rPr>
-  </w:style>
-</w:styles>
-</file>
-
-<file path=word/stylesWithEffects.xml><?xml version="1.0" encoding="utf-8"?>
-<w:styles xmlns:wpc="http://schemas.microsoft.com/office/word/2010/wordprocessingCanvas" xmlns:mc="http://schemas.openxmlformats.org/markup-compatibility/2006" xmlns:o="urn:schemas-microsoft-com:office:office" xmlns:r="http://schemas.openxmlformats.org/officeDocument/2006/relationships" xmlns:m="http://schemas.openxmlformats.org/officeDocument/2006/math" xmlns:v="urn:schemas-microsoft-com:vml" xmlns:wp14="http://schemas.microsoft.com/office/word/2010/wordprocessingDrawing" xmlns:wp="http://schemas.openxmlformats.org/drawingml/2006/wordprocessingDrawing" xmlns:w10="urn:schemas-microsoft-com:office:word" xmlns:w="http://schemas.openxmlformats.org/wordprocessingml/2006/main" xmlns:w14="http://schemas.microsoft.com/office/word/2010/wordml" xmlns:wpg="http://schemas.microsoft.com/office/word/2010/wordprocessingGroup" xmlns:wpi="http://schemas.microsoft.com/office/word/2010/wordprocessingInk" xmlns:wne="http://schemas.microsoft.com/office/word/2006/wordml" xmlns:wps="http://schemas.microsoft.com/office/word/2010/wordprocessingShape" mc:Ignorable="w14 wp14">
-  <w:docDefaults>
-    <w:rPrDefault>
-      <w:rPr>
-        <w:rFonts w:ascii="Arial" w:eastAsia="Arial" w:hAnsi="Arial" w:cs="Arial"/>
-        <w:color w:val="000000"/>
-        <w:sz w:val="22"/>
-        <w:szCs w:val="22"/>
-        <w:lang w:val="en-US" w:eastAsia="en-US" w:bidi="he-IL"/>
-      </w:rPr>
-    </w:rPrDefault>
-    <w:pPrDefault>
-      <w:pPr>
-        <w:pBdr>
-          <w:top w:val="nil"/>
-          <w:left w:val="nil"/>
-          <w:bottom w:val="nil"/>
-          <w:right w:val="nil"/>
-          <w:between w:val="nil"/>
-        </w:pBdr>
-        <w:spacing w:line="276" w:lineRule="auto"/>
-      </w:pPr>
-    </w:pPrDefault>
-  </w:docDefaults>
-  <w:latentStyles w:defLockedState="0" w:defUIPriority="99" w:defSemiHidden="1" w:defUnhideWhenUsed="1" w:defQFormat="0" w:count="267">
-    <w:lsdException w:name="Normal" w:semiHidden="0" w:uiPriority="0" w:unhideWhenUsed="0" w:qFormat="1"/>
-    <w:lsdException w:name="heading 1" w:semiHidden="0" w:uiPriority="9" w:unhideWhenUsed="0" w:qFormat="1"/>
-    <w:lsdException w:name="heading 2" w:uiPriority="9" w:qFormat="1"/>
-    <w:lsdException w:name="heading 3" w:uiPriority="9" w:qFormat="1"/>
-    <w:lsdException w:name="heading 4" w:uiPriority="9" w:qFormat="1"/>
-    <w:lsdException w:name="heading 5" w:uiPriority="9" w:qFormat="1"/>
-    <w:lsdException w:name="heading 6" w:uiPriority="9" w:qFormat="1"/>
-    <w:lsdException w:name="heading 7" w:uiPriority="9" w:qFormat="1"/>
-    <w:lsdException w:name="heading 8" w:uiPriority="9" w:qFormat="1"/>
-    <w:lsdException w:name="heading 9" w:uiPriority="9" w:qFormat="1"/>
-    <w:lsdException w:name="toc 1" w:uiPriority="39"/>
-    <w:lsdException w:name="toc 2" w:uiPriority="39"/>
-    <w:lsdException w:name="toc 3" w:uiPriority="39"/>
-    <w:lsdException w:name="toc 4" w:uiPriority="39"/>
-    <w:lsdException w:name="toc 5" w:uiPriority="39"/>
-    <w:lsdException w:name="toc 6" w:uiPriority="39"/>
-    <w:lsdException w:name="toc 7" w:uiPriority="39"/>
-    <w:lsdException w:name="toc 8" w:uiPriority="39"/>
-    <w:lsdException w:name="toc 9" w:uiPriority="39"/>
-    <w:lsdException w:name="caption" w:uiPriority="35" w:qFormat="1"/>
-    <w:lsdException w:name="Title" w:semiHidden="0" w:uiPriority="10" w:unhideWhenUsed="0" w:qFormat="1"/>
-    <w:lsdException w:name="Default Paragraph Font" w:uiPriority="1"/>
-    <w:lsdException w:name="Subtitle" w:semiHidden="0" w:uiPriority="11" w:unhideWhenUsed="0" w:qFormat="1"/>
-    <w:lsdException w:name="Strong" w:semiHidden="0" w:uiPriority="22" w:unhideWhenUsed="0" w:qFormat="1"/>
-    <w:lsdException w:name="Emphasis" w:semiHidden="0" w:uiPriority="20" w:unhideWhenUsed="0" w:qFormat="1"/>
-    <w:lsdException w:name="Table Grid" w:semiHidden="0" w:uiPriority="59" w:unhideWhenUsed="0"/>
-    <w:lsdException w:name="Placeholder Text" w:unhideWhenUsed="0"/>
-    <w:lsdException w:name="No Spacing" w:semiHidden="0" w:uiPriority="1" w:unhideWhenUsed="0" w:qFormat="1"/>
-    <w:lsdException w:name="Light Shading" w:semiHidden="0" w:uiPriority="60" w:unhideWhenUsed="0"/>
-    <w:lsdException w:name="Light List" w:semiHidden="0" w:uiPriority="61" w:unhideWhenUsed="0"/>
-    <w:lsdException w:name="Light Grid" w:semiHidden="0" w:uiPriority="62" w:unhideWhenUsed="0"/>
-    <w:lsdException w:name="Medium Shading 1" w:semiHidden="0" w:uiPriority="63" w:unhideWhenUsed="0"/>
-    <w:lsdException w:name="Medium Shading 2" w:semiHidden="0" w:uiPriority="64" w:unhideWhenUsed="0"/>
-    <w:lsdException w:name="Medium List 1" w:semiHidden="0" w:uiPriority="65" w:unhideWhenUsed="0"/>
-    <w:lsdException w:name="Medium List 2" w:semiHidden="0" w:uiPriority="66" w:unhideWhenUsed="0"/>
-    <w:lsdException w:name="Medium Grid 1" w:semiHidden="0" w:uiPriority="67" w:unhideWhenUsed="0"/>
-    <w:lsdException w:name="Medium Grid 2" w:semiHidden="0" w:uiPriority="68" w:unhideWhenUsed="0"/>
-    <w:lsdException w:name="Medium Grid 3" w:semiHidden="0" w:uiPriority="69" w:unhideWhenUsed="0"/>
-    <w:lsdException w:name="Dark List" w:semiHidden="0" w:uiPriority="70" w:unhideWhenUsed="0"/>
-    <w:lsdException w:name="Colorful Shading" w:semiHidden="0" w:uiPriority="71" w:unhideWhenUsed="0"/>
-    <w:lsdException w:name="Colorful List" w:semiHidden="0" w:uiPriority="72" w:unhideWhenUsed="0"/>
-    <w:lsdException w:name="Colorful Grid" w:semiHidden="0" w:uiPriority="73" w:unhideWhenUsed="0"/>
-    <w:lsdException w:name="Light Shading Accent 1" w:semiHidden="0" w:uiPriority="60" w:unhideWhenUsed="0"/>
-    <w:lsdException w:name="Light List Accent 1" w:semiHidden="0" w:uiPriority="61" w:unhideWhenUsed="0"/>
-    <w:lsdException w:name="Light Grid Accent 1" w:semiHidden="0" w:uiPriority="62" w:unhideWhenUsed="0"/>
-    <w:lsdException w:name="Medium Shading 1 Accent 1" w:semiHidden="0" w:uiPriority="63" w:unhideWhenUsed="0"/>
-    <w:lsdException w:name="Medium Shading 2 Accent 1" w:semiHidden="0" w:uiPriority="64" w:unhideWhenUsed="0"/>
-    <w:lsdException w:name="Medium List 1 Accent 1" w:semiHidden="0" w:uiPriority="65" w:unhideWhenUsed="0"/>
-    <w:lsdException w:name="Revision" w:unhideWhenUsed="0"/>
-    <w:lsdException w:name="List Paragraph" w:semiHidden="0" w:uiPriority="34" w:unhideWhenUsed="0" w:qFormat="1"/>
-    <w:lsdException w:name="Quote" w:semiHidden="0" w:uiPriority="29" w:unhideWhenUsed="0" w:qFormat="1"/>
-    <w:lsdException w:name="Intense Quote" w:semiHidden="0" w:uiPriority="30" w:unhideWhenUsed="0" w:qFormat="1"/>
-    <w:lsdException w:name="Medium List 2 Accent 1" w:semiHidden="0" w:uiPriority="66" w:unhideWhenUsed="0"/>
-    <w:lsdException w:name="Medium Grid 1 Accent 1" w:semiHidden="0" w:uiPriority="67" w:unhideWhenUsed="0"/>
-    <w:lsdException w:name="Medium Grid 2 Accent 1" w:semiHidden="0" w:uiPriority="68" w:unhideWhenUsed="0"/>
-    <w:lsdException w:name="Medium Grid 3 Accent 1" w:semiHidden="0" w:uiPriority="69" w:unhideWhenUsed="0"/>
-    <w:lsdException w:name="Dark List Accent 1" w:semiHidden="0" w:uiPriority="70" w:unhideWhenUsed="0"/>
-    <w:lsdException w:name="Colorful Shading Accent 1" w:semiHidden="0" w:uiPriority="71" w:unhideWhenUsed="0"/>
-    <w:lsdException w:name="Colorful List Accent 1" w:semiHidden="0" w:uiPriority="72" w:unhideWhenUsed="0"/>
-    <w:lsdException w:name="Colorful Grid Accent 1" w:semiHidden="0" w:uiPriority="73" w:unhideWhenUsed="0"/>
-    <w:lsdException w:name="Light Shading Accent 2" w:semiHidden="0" w:uiPriority="60" w:unhideWhenUsed="0"/>
-    <w:lsdException w:name="Light List Accent 2" w:semiHidden="0" w:uiPriority="61" w:unhideWhenUsed="0"/>
-    <w:lsdException w:name="Light Grid Accent 2" w:semiHidden="0" w:uiPriority="62" w:unhideWhenUsed="0"/>
-    <w:lsdException w:name="Medium Shading 1 Accent 2" w:semiHidden="0" w:uiPriority="63" w:unhideWhenUsed="0"/>
-    <w:lsdException w:name="Medium Shading 2 Accent 2" w:semiHidden="0" w:uiPriority="64" w:unhideWhenUsed="0"/>
-    <w:lsdException w:name="Medium List 1 Accent 2" w:semiHidden="0" w:uiPriority="65" w:unhideWhenUsed="0"/>
-    <w:lsdException w:name="Medium List 2 Accent 2" w:semiHidden="0" w:uiPriority="66" w:unhideWhenUsed="0"/>
-    <w:lsdException w:name="Medium Grid 1 Accent 2" w:semiHidden="0" w:uiPriority="67" w:unhideWhenUsed="0"/>
-    <w:lsdException w:name="Medium Grid 2 Accent 2" w:semiHidden="0" w:uiPriority="68" w:unhideWhenUsed="0"/>
-    <w:lsdException w:name="Medium Grid 3 Accent 2" w:semiHidden="0" w:uiPriority="69" w:unhideWhenUsed="0"/>
-    <w:lsdException w:name="Dark List Accent 2" w:semiHidden="0" w:uiPriority="70" w:unhideWhenUsed="0"/>
-    <w:lsdException w:name="Colorful Shading Accent 2" w:semiHidden="0" w:uiPriority="71" w:unhideWhenUsed="0"/>
-    <w:lsdException w:name="Colorful List Accent 2" w:semiHidden="0" w:uiPriority="72" w:unhideWhenUsed="0"/>
-    <w:lsdException w:name="Colorful Grid Accent 2" w:semiHidden="0" w:uiPriority="73" w:unhideWhenUsed="0"/>
-    <w:lsdException w:name="Light Shading Accent 3" w:semiHidden="0" w:uiPriority="60" w:unhideWhenUsed="0"/>
-    <w:lsdException w:name="Light List Accent 3" w:semiHidden="0" w:uiPriority="61" w:unhideWhenUsed="0"/>
-    <w:lsdException w:name="Light Grid Accent 3" w:semiHidden="0" w:uiPriority="62" w:unhideWhenUsed="0"/>
-    <w:lsdException w:name="Medium Shading 1 Accent 3" w:semiHidden="0" w:uiPriority="63" w:unhideWhenUsed="0"/>
-    <w:lsdException w:name="Medium Shading 2 Accent 3" w:semiHidden="0" w:uiPriority="64" w:unhideWhenUsed="0"/>
-    <w:lsdException w:name="Medium List 1 Accent 3" w:semiHidden="0" w:uiPriority="65" w:unhideWhenUsed="0"/>
-    <w:lsdException w:name="Medium List 2 Accent 3" w:semiHidden="0" w:uiPriority="66" w:unhideWhenUsed="0"/>
-    <w:lsdException w:name="Medium Grid 1 Accent 3" w:semiHidden="0" w:uiPriority="67" w:unhideWhenUsed="0"/>
-    <w:lsdException w:name="Medium Grid 2 Accent 3" w:semiHidden="0" w:uiPriority="68" w:unhideWhenUsed="0"/>
-    <w:lsdException w:name="Medium Grid 3 Accent 3" w:semiHidden="0" w:uiPriority="69" w:unhideWhenUsed="0"/>
-    <w:lsdException w:name="Dark List Accent 3" w:semiHidden="0" w:uiPriority="70" w:unhideWhenUsed="0"/>
-    <w:lsdException w:name="Colorful Shading Accent 3" w:semiHidden="0" w:uiPriority="71" w:unhideWhenUsed="0"/>
-    <w:lsdException w:name="Colorful List Accent 3" w:semiHidden="0" w:uiPriority="72" w:unhideWhenUsed="0"/>
-    <w:lsdException w:name="Colorful Grid Accent 3" w:semiHidden="0" w:uiPriority="73" w:unhideWhenUsed="0"/>
-    <w:lsdException w:name="Light Shading Accent 4" w:semiHidden="0" w:uiPriority="60" w:unhideWhenUsed="0"/>
-    <w:lsdException w:name="Light List Accent 4" w:semiHidden="0" w:uiPriority="61" w:unhideWhenUsed="0"/>
-    <w:lsdException w:name="Light Grid Accent 4" w:semiHidden="0" w:uiPriority="62" w:unhideWhenUsed="0"/>
-    <w:lsdException w:name="Medium Shading 1 Accent 4" w:semiHidden="0" w:uiPriority="63" w:unhideWhenUsed="0"/>
-    <w:lsdException w:name="Medium Shading 2 Accent 4" w:semiHidden="0" w:uiPriority="64" w:unhideWhenUsed="0"/>
-    <w:lsdException w:name="Medium List 1 Accent 4" w:semiHidden="0" w:uiPriority="65" w:unhideWhenUsed="0"/>
-    <w:lsdException w:name="Medium List 2 Accent 4" w:semiHidden="0" w:uiPriority="66" w:unhideWhenUsed="0"/>
-    <w:lsdException w:name="Medium Grid 1 Accent 4" w:semiHidden="0" w:uiPriority="67" w:unhideWhenUsed="0"/>
-    <w:lsdException w:name="Medium Grid 2 Accent 4" w:semiHidden="0" w:uiPriority="68" w:unhideWhenUsed="0"/>
-    <w:lsdException w:name="Medium Grid 3 Accent 4" w:semiHidden="0" w:uiPriority="69" w:unhideWhenUsed="0"/>
-    <w:lsdException w:name="Dark List Accent 4" w:semiHidden="0" w:uiPriority="70" w:unhideWhenUsed="0"/>
-    <w:lsdException w:name="Colorful Shading Accent 4" w:semiHidden="0" w:uiPriority="71" w:unhideWhenUsed="0"/>
-    <w:lsdException w:name="Colorful List Accent 4" w:semiHidden="0" w:uiPriority="72" w:unhideWhenUsed="0"/>
-    <w:lsdException w:name="Colorful Grid Accent 4" w:semiHidden="0" w:uiPriority="73" w:unhideWhenUsed="0"/>
-    <w:lsdException w:name="Light Shading Accent 5" w:semiHidden="0" w:uiPriority="60" w:unhideWhenUsed="0"/>
-    <w:lsdException w:name="Light List Accent 5" w:semiHidden="0" w:uiPriority="61" w:unhideWhenUsed="0"/>
-    <w:lsdException w:name="Light Grid Accent 5" w:semiHidden="0" w:uiPriority="62" w:unhideWhenUsed="0"/>
-    <w:lsdException w:name="Medium Shading 1 Accent 5" w:semiHidden="0" w:uiPriority="63" w:unhideWhenUsed="0"/>
-    <w:lsdException w:name="Medium Shading 2 Accent 5" w:semiHidden="0" w:uiPriority="64" w:unhideWhenUsed="0"/>
-    <w:lsdException w:name="Medium List 1 Accent 5" w:semiHidden="0" w:uiPriority="65" w:unhideWhenUsed="0"/>
-    <w:lsdException w:name="Medium List 2 Accent 5" w:semiHidden="0" w:uiPriority="66" w:unhideWhenUsed="0"/>
-    <w:lsdException w:name="Medium Grid 1 Accent 5" w:semiHidden="0" w:uiPriority="67" w:unhideWhenUsed="0"/>
-    <w:lsdException w:name="Medium Grid 2 Accent 5" w:semiHidden="0" w:uiPriority="68" w:unhideWhenUsed="0"/>
-    <w:lsdException w:name="Medium Grid 3 Accent 5" w:semiHidden="0" w:uiPriority="69" w:unhideWhenUsed="0"/>
-    <w:lsdException w:name="Dark List Accent 5" w:semiHidden="0" w:uiPriority="70" w:unhideWhenUsed="0"/>
-    <w:lsdException w:name="Colorful Shading Accent 5" w:semiHidden="0" w:uiPriority="71" w:unhideWhenUsed="0"/>
-    <w:lsdException w:name="Colorful List Accent 5" w:semiHidden="0" w:uiPriority="72" w:unhideWhenUsed="0"/>
-    <w:lsdException w:name="Colorful Grid Accent 5" w:semiHidden="0" w:uiPriority="73" w:unhideWhenUsed="0"/>
-    <w:lsdException w:name="Light Shading Accent 6" w:semiHidden="0" w:uiPriority="60" w:unhideWhenUsed="0"/>
-    <w:lsdException w:name="Light List Accent 6" w:semiHidden="0" w:uiPriority="61" w:unhideWhenUsed="0"/>
-    <w:lsdException w:name="Light Grid Accent 6" w:semiHidden="0" w:uiPriority="62" w:unhideWhenUsed="0"/>
-    <w:lsdException w:name="Medium Shading 1 Accent 6" w:semiHidden="0" w:uiPriority="63" w:unhideWhenUsed="0"/>
-    <w:lsdException w:name="Medium Shading 2 Accent 6" w:semiHidden="0" w:uiPriority="64" w:unhideWhenUsed="0"/>
-    <w:lsdException w:name="Medium List 1 Accent 6" w:semiHidden="0" w:uiPriority="65" w:unhideWhenUsed="0"/>
-    <w:lsdException w:name="Medium List 2 Accent 6" w:semiHidden="0" w:uiPriority="66" w:unhideWhenUsed="0"/>
-    <w:lsdException w:name="Medium Grid 1 Accent 6" w:semiHidden="0" w:uiPriority="67" w:unhideWhenUsed="0"/>
-    <w:lsdException w:name="Medium Grid 2 Accent 6" w:semiHidden="0" w:uiPriority="68" w:unhideWhenUsed="0"/>
-    <w:lsdException w:name="Medium Grid 3 Accent 6" w:semiHidden="0" w:uiPriority="69" w:unhideWhenUsed="0"/>
-    <w:lsdException w:name="Dark List Accent 6" w:semiHidden="0" w:uiPriority="70" w:unhideWhenUsed="0"/>
-    <w:lsdException w:name="Colorful Shading Accent 6" w:semiHidden="0" w:uiPriority="71" w:unhideWhenUsed="0"/>
-    <w:lsdException w:name="Colorful List Accent 6" w:semiHidden="0" w:uiPriority="72" w:unhideWhenUsed="0"/>
-    <w:lsdException w:name="Colorful Grid Accent 6" w:semiHidden="0" w:uiPriority="73" w:unhideWhenUsed="0"/>
-    <w:lsdException w:name="Subtle Emphasis" w:semiHidden="0" w:uiPriority="19" w:unhideWhenUsed="0" w:qFormat="1"/>
-    <w:lsdException w:name="Intense Emphasis" w:semiHidden="0" w:uiPriority="21" w:unhideWhenUsed="0" w:qFormat="1"/>
-    <w:lsdException w:name="Subtle Reference" w:semiHidden="0" w:uiPriority="31" w:unhideWhenUsed="0" w:qFormat="1"/>
-    <w:lsdException w:name="Intense Reference" w:semiHidden="0" w:uiPriority="32" w:unhideWhenUsed="0" w:qFormat="1"/>
-    <w:lsdException w:name="Book Title" w:semiHidden="0" w:uiPriority="33" w:unhideWhenUsed="0" w:qFormat="1"/>
-    <w:lsdException w:name="Bibliography" w:uiPriority="37"/>
-    <w:lsdException w:name="TOC Heading" w:uiPriority="39" w:qFormat="1"/>
-  </w:latentStyles>
-  <w:style w:type="paragraph" w:default="1" w:styleId="a">
-    <w:name w:val="Normal"/>
-  </w:style>
-  <w:style w:type="paragraph" w:styleId="1">
-    <w:name w:val="heading 1"/>
-    <w:basedOn w:val="a"/>
-    <w:next w:val="a"/>
-    <w:pPr>
-      <w:keepNext/>
-      <w:keepLines/>
-      <w:spacing w:before="400" w:after="120"/>
-      <w:outlineLvl w:val="0"/>
-    </w:pPr>
-    <w:rPr>
-      <w:sz w:val="40"/>
-      <w:szCs w:val="40"/>
-    </w:rPr>
-  </w:style>
-  <w:style w:type="paragraph" w:styleId="2">
-    <w:name w:val="heading 2"/>
-    <w:basedOn w:val="a"/>
-    <w:next w:val="a"/>
-    <w:pPr>
-      <w:keepNext/>
-      <w:keepLines/>
-      <w:spacing w:before="360" w:after="120"/>
-      <w:outlineLvl w:val="1"/>
-    </w:pPr>
-    <w:rPr>
-      <w:sz w:val="32"/>
-      <w:szCs w:val="32"/>
-    </w:rPr>
-  </w:style>
-  <w:style w:type="paragraph" w:styleId="3">
-    <w:name w:val="heading 3"/>
-    <w:basedOn w:val="a"/>
-    <w:next w:val="a"/>
-    <w:pPr>
-      <w:keepNext/>
-      <w:keepLines/>
-      <w:spacing w:before="320" w:after="80"/>
-      <w:outlineLvl w:val="2"/>
-    </w:pPr>
-    <w:rPr>
-      <w:color w:val="434343"/>
-      <w:sz w:val="28"/>
-      <w:szCs w:val="28"/>
-    </w:rPr>
-  </w:style>
-  <w:style w:type="paragraph" w:styleId="4">
-    <w:name w:val="heading 4"/>
-    <w:basedOn w:val="a"/>
-    <w:next w:val="a"/>
-    <w:pPr>
-      <w:keepNext/>
-      <w:keepLines/>
-      <w:spacing w:before="280" w:after="80"/>
-      <w:outlineLvl w:val="3"/>
-    </w:pPr>
-    <w:rPr>
-      <w:color w:val="666666"/>
-      <w:sz w:val="24"/>
-      <w:szCs w:val="24"/>
-    </w:rPr>
-  </w:style>
-  <w:style w:type="paragraph" w:styleId="5">
-    <w:name w:val="heading 5"/>
-    <w:basedOn w:val="a"/>
-    <w:next w:val="a"/>
-    <w:pPr>
-      <w:keepNext/>
-      <w:keepLines/>
-      <w:spacing w:before="240" w:after="80"/>
-      <w:outlineLvl w:val="4"/>
-    </w:pPr>
-    <w:rPr>
-      <w:color w:val="666666"/>
-    </w:rPr>
-  </w:style>
-  <w:style w:type="paragraph" w:styleId="6">
-    <w:name w:val="heading 6"/>
-    <w:basedOn w:val="a"/>
-    <w:next w:val="a"/>
-    <w:pPr>
-      <w:keepNext/>
-      <w:keepLines/>
-      <w:spacing w:before="240" w:after="80"/>
-      <w:outlineLvl w:val="5"/>
-    </w:pPr>
-    <w:rPr>
-      <w:i/>
-      <w:color w:val="666666"/>
-    </w:rPr>
-  </w:style>
-  <w:style w:type="character" w:default="1" w:styleId="a0">
-    <w:name w:val="Default Paragraph Font"/>
-    <w:uiPriority w:val="1"/>
-    <w:semiHidden/>
-    <w:unhideWhenUsed/>
-  </w:style>
-  <w:style w:type="table" w:default="1" w:styleId="a1">
-    <w:name w:val="Normal Table"/>
-    <w:uiPriority w:val="99"/>
-    <w:semiHidden/>
-    <w:unhideWhenUsed/>
-    <w:tblPr>
-      <w:tblInd w:w="0" w:type="dxa"/>
-      <w:tblCellMar>
-        <w:top w:w="0" w:type="dxa"/>
-        <w:left w:w="108" w:type="dxa"/>
-        <w:bottom w:w="0" w:type="dxa"/>
-        <w:right w:w="108" w:type="dxa"/>
-      </w:tblCellMar>
-    </w:tblPr>
-  </w:style>
-  <w:style w:type="numbering" w:default="1" w:styleId="a2">
-    <w:name w:val="No List"/>
-    <w:uiPriority w:val="99"/>
-    <w:semiHidden/>
-    <w:unhideWhenUsed/>
-  </w:style>
-  <w:style w:type="table" w:customStyle="1" w:styleId="TableNormal">
-    <w:name w:val="Table Normal"/>
-    <w:tblPr>
-      <w:tblCellMar>
-        <w:top w:w="0" w:type="dxa"/>
-        <w:left w:w="0" w:type="dxa"/>
-        <w:bottom w:w="0" w:type="dxa"/>
-        <w:right w:w="0" w:type="dxa"/>
-      </w:tblCellMar>
-    </w:tblPr>
-  </w:style>
-  <w:style w:type="paragraph" w:styleId="a3">
-    <w:name w:val="Title"/>
-    <w:basedOn w:val="a"/>
-    <w:next w:val="a"/>
-    <w:pPr>
-      <w:keepNext/>
-      <w:keepLines/>
-      <w:bidi/>
-      <w:spacing w:after="60"/>
-      <w:jc w:val="center"/>
-    </w:pPr>
-    <w:rPr>
-      <w:sz w:val="52"/>
-      <w:szCs w:val="52"/>
-    </w:rPr>
-  </w:style>
-  <w:style w:type="paragraph" w:styleId="a4">
-    <w:name w:val="Subtitle"/>
-    <w:basedOn w:val="a"/>
-    <w:next w:val="a"/>
-    <w:pPr>
-      <w:keepNext/>
-      <w:keepLines/>
-      <w:spacing w:after="320"/>
-    </w:pPr>
-    <w:rPr>
-      <w:color w:val="666666"/>
-      <w:sz w:val="30"/>
-      <w:szCs w:val="30"/>
-    </w:rPr>
-  </w:style>
-  <w:style w:type="table" w:customStyle="1" w:styleId="a5">
-    <w:basedOn w:val="TableNormal"/>
-    <w:tblPr>
-      <w:tblStyleRowBandSize w:val="1"/>
-      <w:tblStyleColBandSize w:val="1"/>
-      <w:tblCellMar>
-        <w:top w:w="100" w:type="dxa"/>
-        <w:left w:w="100" w:type="dxa"/>
-        <w:bottom w:w="100" w:type="dxa"/>
-        <w:right w:w="100" w:type="dxa"/>
-      </w:tblCellMar>
-    </w:tblPr>
-  </w:style>
-  <w:style w:type="paragraph" w:styleId="a6">
-    <w:name w:val="Balloon Text"/>
-    <w:basedOn w:val="a"/>
-    <w:link w:val="a7"/>
-    <w:uiPriority w:val="99"/>
-    <w:semiHidden/>
-    <w:unhideWhenUsed/>
-    <w:rsid w:val="00E271FC"/>
-    <w:pPr>
-      <w:spacing w:line="240" w:lineRule="auto"/>
-    </w:pPr>
-    <w:rPr>
-      <w:rFonts w:ascii="Tahoma" w:hAnsi="Tahoma" w:cs="Tahoma"/>
-      <w:sz w:val="16"/>
-      <w:szCs w:val="16"/>
-    </w:rPr>
-  </w:style>
-  <w:style w:type="character" w:customStyle="1" w:styleId="a7">
-    <w:name w:val="טקסט בלונים תו"/>
-    <w:basedOn w:val="a0"/>
-    <w:link w:val="a6"/>
+  <w:style w:type="character" w:customStyle="1" w:styleId="BalloonTextChar">
+    <w:name w:val="Balloon Text Char"/>
+    <w:basedOn w:val="DefaultParagraphFont"/>
+    <w:link w:val="BalloonText"/>
     <w:uiPriority w:val="99"/>
     <w:semiHidden/>
     <w:rsid w:val="00E271FC"/>

</xml_diff>